<commit_message>
update Project Report, Publication, PPT
</commit_message>
<xml_diff>
--- a/Project Report, Publication, PPT/Published Paper.docx
+++ b/Project Report, Publication, PPT/Published Paper.docx
@@ -1,6 +1,6 @@
 
 <file path=word/document.xml><?xml version="1.0" encoding="utf-8"?>
-<w:document xmlns:wpc="http://schemas.microsoft.com/office/word/2010/wordprocessingCanvas" xmlns:cx="http://schemas.microsoft.com/office/drawing/2014/chartex" xmlns:cx1="http://schemas.microsoft.com/office/drawing/2015/9/8/chartex" xmlns:cx2="http://schemas.microsoft.com/office/drawing/2015/10/21/chartex" xmlns:cx3="http://schemas.microsoft.com/office/drawing/2016/5/9/chartex" xmlns:cx4="http://schemas.microsoft.com/office/drawing/2016/5/10/chartex" xmlns:cx5="http://schemas.microsoft.com/office/drawing/2016/5/11/chartex" xmlns:cx6="http://schemas.microsoft.com/office/drawing/2016/5/12/chartex" xmlns:cx7="http://schemas.microsoft.com/office/drawing/2016/5/13/chartex" xmlns:cx8="http://schemas.microsoft.com/office/drawing/2016/5/14/chartex" xmlns:mc="http://schemas.openxmlformats.org/markup-compatibility/2006" xmlns:aink="http://schemas.microsoft.com/office/drawing/2016/ink" xmlns:am3d="http://schemas.microsoft.com/office/drawing/2017/model3d" xmlns:o="urn:schemas-microsoft-com:office:office" xmlns:r="http://schemas.openxmlformats.org/officeDocument/2006/relationships" xmlns:m="http://schemas.openxmlformats.org/officeDocument/2006/math" xmlns:v="urn:schemas-microsoft-com:vml" xmlns:wp14="http://schemas.microsoft.com/office/word/2010/wordprocessingDrawing" xmlns:wp="http://schemas.openxmlformats.org/drawingml/2006/wordprocessingDrawing" xmlns:w10="urn:schemas-microsoft-com:office:word" xmlns:w="http://schemas.openxmlformats.org/wordprocessingml/2006/main" xmlns:w14="http://schemas.microsoft.com/office/word/2010/wordml" xmlns:w15="http://schemas.microsoft.com/office/word/2012/wordml" xmlns:w16cex="http://schemas.microsoft.com/office/word/2018/wordml/cex" xmlns:w16cid="http://schemas.microsoft.com/office/word/2016/wordml/cid" xmlns:w16="http://schemas.microsoft.com/office/word/2018/wordml" xmlns:w16sdtdh="http://schemas.microsoft.com/office/word/2020/wordml/sdtdatahash" xmlns:w16se="http://schemas.microsoft.com/office/word/2015/wordml/symex" xmlns:wpg="http://schemas.microsoft.com/office/word/2010/wordprocessingGroup" xmlns:wpi="http://schemas.microsoft.com/office/word/2010/wordprocessingInk" xmlns:wne="http://schemas.microsoft.com/office/word/2006/wordml" xmlns:wps="http://schemas.microsoft.com/office/word/2010/wordprocessingShape" mc:Ignorable="w14 w15 w16se w16cid w16 w16cex w16sdtdh wp14">
+<w:document xmlns:wpc="http://schemas.microsoft.com/office/word/2010/wordprocessingCanvas" xmlns:cx="http://schemas.microsoft.com/office/drawing/2014/chartex" xmlns:cx1="http://schemas.microsoft.com/office/drawing/2015/9/8/chartex" xmlns:cx2="http://schemas.microsoft.com/office/drawing/2015/10/21/chartex" xmlns:cx3="http://schemas.microsoft.com/office/drawing/2016/5/9/chartex" xmlns:cx4="http://schemas.microsoft.com/office/drawing/2016/5/10/chartex" xmlns:cx5="http://schemas.microsoft.com/office/drawing/2016/5/11/chartex" xmlns:cx6="http://schemas.microsoft.com/office/drawing/2016/5/12/chartex" xmlns:cx7="http://schemas.microsoft.com/office/drawing/2016/5/13/chartex" xmlns:cx8="http://schemas.microsoft.com/office/drawing/2016/5/14/chartex" xmlns:mc="http://schemas.openxmlformats.org/markup-compatibility/2006" xmlns:aink="http://schemas.microsoft.com/office/drawing/2016/ink" xmlns:am3d="http://schemas.microsoft.com/office/drawing/2017/model3d" xmlns:o="urn:schemas-microsoft-com:office:office" xmlns:oel="http://schemas.microsoft.com/office/2019/extlst" xmlns:r="http://schemas.openxmlformats.org/officeDocument/2006/relationships" xmlns:m="http://schemas.openxmlformats.org/officeDocument/2006/math" xmlns:v="urn:schemas-microsoft-com:vml" xmlns:wp14="http://schemas.microsoft.com/office/word/2010/wordprocessingDrawing" xmlns:wp="http://schemas.openxmlformats.org/drawingml/2006/wordprocessingDrawing" xmlns:w10="urn:schemas-microsoft-com:office:word" xmlns:w="http://schemas.openxmlformats.org/wordprocessingml/2006/main" xmlns:w14="http://schemas.microsoft.com/office/word/2010/wordml" xmlns:w15="http://schemas.microsoft.com/office/word/2012/wordml" xmlns:w16cex="http://schemas.microsoft.com/office/word/2018/wordml/cex" xmlns:w16cid="http://schemas.microsoft.com/office/word/2016/wordml/cid" xmlns:w16="http://schemas.microsoft.com/office/word/2018/wordml" xmlns:w16sdtdh="http://schemas.microsoft.com/office/word/2020/wordml/sdtdatahash" xmlns:w16se="http://schemas.microsoft.com/office/word/2015/wordml/symex" xmlns:wpg="http://schemas.microsoft.com/office/word/2010/wordprocessingGroup" xmlns:wpi="http://schemas.microsoft.com/office/word/2010/wordprocessingInk" xmlns:wne="http://schemas.microsoft.com/office/word/2006/wordml" xmlns:wps="http://schemas.microsoft.com/office/word/2010/wordprocessingShape" mc:Ignorable="w14 w15 w16se w16cid w16 w16cex w16sdtdh wp14">
   <w:body>
     <w:p>
       <w:pPr>
@@ -53,7 +53,1008 @@
             <w:pPr>
               <w:pStyle w:val="Heading1"/>
               <w:spacing w:before="0" w:after="0"/>
-              <w:jc w:val="both"/>
+              <w:jc w:val="center"/>
+              <w:rPr>
+                <w:rFonts w:ascii="Times New Roman" w:hAnsi="Times New Roman" w:cs="Times New Roman"/>
+                <w:b w:val="0"/>
+                <w:bCs w:val="0"/>
+                <w:color w:val="auto"/>
+                <w:sz w:val="24"/>
+                <w:szCs w:val="24"/>
+              </w:rPr>
+            </w:pPr>
+            <w:r>
+              <w:rPr>
+                <w:rFonts w:ascii="Times New Roman" w:hAnsi="Times New Roman" w:cs="Times New Roman"/>
+                <w:b w:val="0"/>
+                <w:bCs w:val="0"/>
+                <w:color w:val="auto"/>
+                <w:sz w:val="24"/>
+                <w:szCs w:val="24"/>
+              </w:rPr>
+              <w:t>Akash S</w:t>
+            </w:r>
+            <w:r>
+              <w:rPr>
+                <w:rFonts w:ascii="Times New Roman" w:hAnsi="Times New Roman" w:cs="Times New Roman"/>
+                <w:b w:val="0"/>
+                <w:bCs w:val="0"/>
+                <w:color w:val="auto"/>
+                <w:sz w:val="24"/>
+                <w:szCs w:val="24"/>
+              </w:rPr>
+              <w:t>M</w:t>
+            </w:r>
+          </w:p>
+          <w:p>
+            <w:pPr>
+              <w:pStyle w:val="Heading1"/>
+              <w:spacing w:before="0" w:after="0"/>
+              <w:jc w:val="center"/>
+              <w:rPr>
+                <w:rFonts w:ascii="Times New Roman" w:hAnsi="Times New Roman" w:cs="Times New Roman"/>
+                <w:b w:val="0"/>
+                <w:bCs w:val="0"/>
+                <w:color w:val="auto"/>
+                <w:sz w:val="20"/>
+                <w:szCs w:val="20"/>
+              </w:rPr>
+            </w:pPr>
+            <w:r>
+              <w:rPr>
+                <w:rFonts w:ascii="Times New Roman" w:hAnsi="Times New Roman" w:cs="Times New Roman"/>
+                <w:b w:val="0"/>
+                <w:bCs w:val="0"/>
+                <w:color w:val="auto"/>
+                <w:sz w:val="20"/>
+                <w:szCs w:val="20"/>
+              </w:rPr>
+              <w:t>Department of Computer Science</w:t>
+            </w:r>
+          </w:p>
+          <w:p>
+            <w:pPr>
+              <w:pStyle w:val="Heading1"/>
+              <w:spacing w:before="0" w:after="0"/>
+              <w:jc w:val="center"/>
+              <w:rPr>
+                <w:rFonts w:ascii="Times New Roman" w:hAnsi="Times New Roman" w:cs="Times New Roman"/>
+                <w:b w:val="0"/>
+                <w:bCs w:val="0"/>
+                <w:color w:val="auto"/>
+                <w:sz w:val="20"/>
+                <w:szCs w:val="20"/>
+              </w:rPr>
+            </w:pPr>
+            <w:r>
+              <w:rPr>
+                <w:rFonts w:ascii="Times New Roman" w:hAnsi="Times New Roman" w:cs="Times New Roman"/>
+                <w:b w:val="0"/>
+                <w:bCs w:val="0"/>
+                <w:color w:val="auto"/>
+                <w:sz w:val="20"/>
+                <w:szCs w:val="20"/>
+              </w:rPr>
+              <w:t>and Engineering,</w:t>
+            </w:r>
+          </w:p>
+          <w:p>
+            <w:pPr>
+              <w:pStyle w:val="Heading1"/>
+              <w:spacing w:before="0" w:after="0"/>
+              <w:jc w:val="center"/>
+              <w:rPr>
+                <w:rFonts w:ascii="Times New Roman" w:hAnsi="Times New Roman" w:cs="Times New Roman"/>
+                <w:b w:val="0"/>
+                <w:bCs w:val="0"/>
+                <w:color w:val="auto"/>
+                <w:sz w:val="20"/>
+                <w:szCs w:val="20"/>
+              </w:rPr>
+            </w:pPr>
+            <w:r>
+              <w:rPr>
+                <w:rFonts w:ascii="Times New Roman" w:hAnsi="Times New Roman" w:cs="Times New Roman"/>
+                <w:b w:val="0"/>
+                <w:bCs w:val="0"/>
+                <w:color w:val="auto"/>
+                <w:sz w:val="20"/>
+                <w:szCs w:val="20"/>
+              </w:rPr>
+              <w:t>Faculty of Engineering and</w:t>
+            </w:r>
+          </w:p>
+          <w:p>
+            <w:pPr>
+              <w:pStyle w:val="Heading1"/>
+              <w:spacing w:before="0" w:after="0"/>
+              <w:jc w:val="center"/>
+              <w:rPr>
+                <w:rFonts w:ascii="Times New Roman" w:hAnsi="Times New Roman" w:cs="Times New Roman"/>
+                <w:b w:val="0"/>
+                <w:bCs w:val="0"/>
+                <w:color w:val="auto"/>
+                <w:sz w:val="20"/>
+                <w:szCs w:val="20"/>
+              </w:rPr>
+            </w:pPr>
+            <w:r>
+              <w:rPr>
+                <w:rFonts w:ascii="Times New Roman" w:hAnsi="Times New Roman" w:cs="Times New Roman"/>
+                <w:b w:val="0"/>
+                <w:bCs w:val="0"/>
+                <w:color w:val="auto"/>
+                <w:sz w:val="20"/>
+                <w:szCs w:val="20"/>
+              </w:rPr>
+              <w:t>Technology, Jain University,</w:t>
+            </w:r>
+          </w:p>
+          <w:p>
+            <w:pPr>
+              <w:pStyle w:val="Heading1"/>
+              <w:spacing w:before="0" w:after="0"/>
+              <w:jc w:val="center"/>
+              <w:rPr>
+                <w:rFonts w:ascii="Times New Roman" w:hAnsi="Times New Roman" w:cs="Times New Roman"/>
+                <w:b w:val="0"/>
+                <w:bCs w:val="0"/>
+                <w:color w:val="auto"/>
+                <w:sz w:val="20"/>
+                <w:szCs w:val="20"/>
+              </w:rPr>
+            </w:pPr>
+            <w:r>
+              <w:rPr>
+                <w:rFonts w:ascii="Times New Roman" w:hAnsi="Times New Roman" w:cs="Times New Roman"/>
+                <w:b w:val="0"/>
+                <w:bCs w:val="0"/>
+                <w:color w:val="auto"/>
+                <w:sz w:val="20"/>
+                <w:szCs w:val="20"/>
+              </w:rPr>
+              <w:t>Bengaluru, Karnataka, India</w:t>
+            </w:r>
+          </w:p>
+          <w:p>
+            <w:pPr>
+              <w:pStyle w:val="Heading1"/>
+              <w:spacing w:before="0" w:after="0"/>
+              <w:jc w:val="center"/>
+              <w:rPr>
+                <w:rFonts w:ascii="Times New Roman" w:hAnsi="Times New Roman" w:cs="Times New Roman"/>
+                <w:color w:val="auto"/>
+              </w:rPr>
+            </w:pPr>
+          </w:p>
+        </w:tc>
+        <w:tc>
+          <w:tcPr>
+            <w:tcW w:w="3237" w:type="dxa"/>
+          </w:tcPr>
+          <w:p>
+            <w:pPr>
+              <w:pStyle w:val="Heading1"/>
+              <w:spacing w:before="0" w:after="0"/>
+              <w:jc w:val="center"/>
+              <w:rPr>
+                <w:rFonts w:ascii="Times New Roman" w:hAnsi="Times New Roman" w:cs="Times New Roman"/>
+                <w:b w:val="0"/>
+                <w:bCs w:val="0"/>
+                <w:color w:val="auto"/>
+                <w:sz w:val="24"/>
+                <w:szCs w:val="24"/>
+              </w:rPr>
+            </w:pPr>
+            <w:r>
+              <w:rPr>
+                <w:rFonts w:ascii="Times New Roman" w:hAnsi="Times New Roman" w:cs="Times New Roman"/>
+                <w:b w:val="0"/>
+                <w:bCs w:val="0"/>
+                <w:color w:val="auto"/>
+                <w:sz w:val="24"/>
+                <w:szCs w:val="24"/>
+              </w:rPr>
+              <w:t>Avinash GK</w:t>
+            </w:r>
+          </w:p>
+          <w:p>
+            <w:pPr>
+              <w:pStyle w:val="Heading1"/>
+              <w:spacing w:before="0" w:after="0"/>
+              <w:jc w:val="center"/>
+              <w:rPr>
+                <w:rFonts w:ascii="Times New Roman" w:hAnsi="Times New Roman" w:cs="Times New Roman"/>
+                <w:b w:val="0"/>
+                <w:bCs w:val="0"/>
+                <w:color w:val="auto"/>
+                <w:sz w:val="20"/>
+                <w:szCs w:val="20"/>
+              </w:rPr>
+            </w:pPr>
+            <w:r>
+              <w:rPr>
+                <w:rFonts w:ascii="Times New Roman" w:hAnsi="Times New Roman" w:cs="Times New Roman"/>
+                <w:b w:val="0"/>
+                <w:bCs w:val="0"/>
+                <w:color w:val="auto"/>
+                <w:sz w:val="20"/>
+                <w:szCs w:val="20"/>
+              </w:rPr>
+              <w:t>Department of Computer Science</w:t>
+            </w:r>
+          </w:p>
+          <w:p>
+            <w:pPr>
+              <w:pStyle w:val="Heading1"/>
+              <w:spacing w:before="0" w:after="0"/>
+              <w:jc w:val="center"/>
+              <w:rPr>
+                <w:rFonts w:ascii="Times New Roman" w:hAnsi="Times New Roman" w:cs="Times New Roman"/>
+                <w:b w:val="0"/>
+                <w:bCs w:val="0"/>
+                <w:color w:val="auto"/>
+                <w:sz w:val="20"/>
+                <w:szCs w:val="20"/>
+              </w:rPr>
+            </w:pPr>
+            <w:r>
+              <w:rPr>
+                <w:rFonts w:ascii="Times New Roman" w:hAnsi="Times New Roman" w:cs="Times New Roman"/>
+                <w:b w:val="0"/>
+                <w:bCs w:val="0"/>
+                <w:color w:val="auto"/>
+                <w:sz w:val="20"/>
+                <w:szCs w:val="20"/>
+              </w:rPr>
+              <w:t>and Engineering,</w:t>
+            </w:r>
+          </w:p>
+          <w:p>
+            <w:pPr>
+              <w:pStyle w:val="Heading1"/>
+              <w:spacing w:before="0" w:after="0"/>
+              <w:jc w:val="center"/>
+              <w:rPr>
+                <w:rFonts w:ascii="Times New Roman" w:hAnsi="Times New Roman" w:cs="Times New Roman"/>
+                <w:b w:val="0"/>
+                <w:bCs w:val="0"/>
+                <w:color w:val="auto"/>
+                <w:sz w:val="20"/>
+                <w:szCs w:val="20"/>
+              </w:rPr>
+            </w:pPr>
+            <w:r>
+              <w:rPr>
+                <w:rFonts w:ascii="Times New Roman" w:hAnsi="Times New Roman" w:cs="Times New Roman"/>
+                <w:b w:val="0"/>
+                <w:bCs w:val="0"/>
+                <w:color w:val="auto"/>
+                <w:sz w:val="20"/>
+                <w:szCs w:val="20"/>
+              </w:rPr>
+              <w:t>Faculty of Engineering and</w:t>
+            </w:r>
+          </w:p>
+          <w:p>
+            <w:pPr>
+              <w:pStyle w:val="Heading1"/>
+              <w:spacing w:before="0" w:after="0"/>
+              <w:jc w:val="center"/>
+              <w:rPr>
+                <w:rFonts w:ascii="Times New Roman" w:hAnsi="Times New Roman" w:cs="Times New Roman"/>
+                <w:b w:val="0"/>
+                <w:bCs w:val="0"/>
+                <w:color w:val="auto"/>
+                <w:sz w:val="20"/>
+                <w:szCs w:val="20"/>
+              </w:rPr>
+            </w:pPr>
+            <w:r>
+              <w:rPr>
+                <w:rFonts w:ascii="Times New Roman" w:hAnsi="Times New Roman" w:cs="Times New Roman"/>
+                <w:b w:val="0"/>
+                <w:bCs w:val="0"/>
+                <w:color w:val="auto"/>
+                <w:sz w:val="20"/>
+                <w:szCs w:val="20"/>
+              </w:rPr>
+              <w:t>Technology, Jain University,</w:t>
+            </w:r>
+          </w:p>
+          <w:p>
+            <w:pPr>
+              <w:pStyle w:val="Heading1"/>
+              <w:spacing w:before="0" w:after="0"/>
+              <w:jc w:val="center"/>
+              <w:rPr>
+                <w:rFonts w:ascii="Times New Roman" w:hAnsi="Times New Roman" w:cs="Times New Roman"/>
+                <w:color w:val="auto"/>
+              </w:rPr>
+            </w:pPr>
+            <w:r>
+              <w:rPr>
+                <w:rFonts w:ascii="Times New Roman" w:hAnsi="Times New Roman" w:cs="Times New Roman"/>
+                <w:b w:val="0"/>
+                <w:bCs w:val="0"/>
+                <w:color w:val="auto"/>
+                <w:sz w:val="20"/>
+                <w:szCs w:val="20"/>
+              </w:rPr>
+              <w:t>Bengaluru, Karnataka, India</w:t>
+            </w:r>
+          </w:p>
+        </w:tc>
+        <w:tc>
+          <w:tcPr>
+            <w:tcW w:w="3237" w:type="dxa"/>
+          </w:tcPr>
+          <w:p>
+            <w:pPr>
+              <w:pStyle w:val="Heading1"/>
+              <w:spacing w:before="0" w:after="0"/>
+              <w:jc w:val="center"/>
+              <w:rPr>
+                <w:rFonts w:ascii="Times New Roman" w:hAnsi="Times New Roman" w:cs="Times New Roman"/>
+                <w:b w:val="0"/>
+                <w:bCs w:val="0"/>
+                <w:color w:val="auto"/>
+                <w:sz w:val="24"/>
+                <w:szCs w:val="24"/>
+              </w:rPr>
+            </w:pPr>
+            <w:r>
+              <w:rPr>
+                <w:rFonts w:ascii="Times New Roman" w:hAnsi="Times New Roman" w:cs="Times New Roman"/>
+                <w:b w:val="0"/>
+                <w:bCs w:val="0"/>
+                <w:color w:val="auto"/>
+                <w:sz w:val="24"/>
+                <w:szCs w:val="24"/>
+              </w:rPr>
+              <w:t>Aditya K</w:t>
+            </w:r>
+          </w:p>
+          <w:p>
+            <w:pPr>
+              <w:pStyle w:val="Heading1"/>
+              <w:spacing w:before="0" w:after="0"/>
+              <w:jc w:val="center"/>
+              <w:rPr>
+                <w:rFonts w:ascii="Times New Roman" w:hAnsi="Times New Roman" w:cs="Times New Roman"/>
+                <w:b w:val="0"/>
+                <w:bCs w:val="0"/>
+                <w:color w:val="auto"/>
+                <w:sz w:val="20"/>
+                <w:szCs w:val="20"/>
+              </w:rPr>
+            </w:pPr>
+            <w:r>
+              <w:rPr>
+                <w:rFonts w:ascii="Times New Roman" w:hAnsi="Times New Roman" w:cs="Times New Roman"/>
+                <w:b w:val="0"/>
+                <w:bCs w:val="0"/>
+                <w:color w:val="auto"/>
+                <w:sz w:val="20"/>
+                <w:szCs w:val="20"/>
+              </w:rPr>
+              <w:t>Department of Computer Science</w:t>
+            </w:r>
+          </w:p>
+          <w:p>
+            <w:pPr>
+              <w:pStyle w:val="Heading1"/>
+              <w:spacing w:before="0" w:after="0"/>
+              <w:jc w:val="center"/>
+              <w:rPr>
+                <w:rFonts w:ascii="Times New Roman" w:hAnsi="Times New Roman" w:cs="Times New Roman"/>
+                <w:b w:val="0"/>
+                <w:bCs w:val="0"/>
+                <w:color w:val="auto"/>
+                <w:sz w:val="20"/>
+                <w:szCs w:val="20"/>
+              </w:rPr>
+            </w:pPr>
+            <w:r>
+              <w:rPr>
+                <w:rFonts w:ascii="Times New Roman" w:hAnsi="Times New Roman" w:cs="Times New Roman"/>
+                <w:b w:val="0"/>
+                <w:bCs w:val="0"/>
+                <w:color w:val="auto"/>
+                <w:sz w:val="20"/>
+                <w:szCs w:val="20"/>
+              </w:rPr>
+              <w:t>and Engineering,</w:t>
+            </w:r>
+          </w:p>
+          <w:p>
+            <w:pPr>
+              <w:pStyle w:val="Heading1"/>
+              <w:spacing w:before="0" w:after="0"/>
+              <w:jc w:val="center"/>
+              <w:rPr>
+                <w:rFonts w:ascii="Times New Roman" w:hAnsi="Times New Roman" w:cs="Times New Roman"/>
+                <w:b w:val="0"/>
+                <w:bCs w:val="0"/>
+                <w:color w:val="auto"/>
+                <w:sz w:val="20"/>
+                <w:szCs w:val="20"/>
+              </w:rPr>
+            </w:pPr>
+            <w:r>
+              <w:rPr>
+                <w:rFonts w:ascii="Times New Roman" w:hAnsi="Times New Roman" w:cs="Times New Roman"/>
+                <w:b w:val="0"/>
+                <w:bCs w:val="0"/>
+                <w:color w:val="auto"/>
+                <w:sz w:val="20"/>
+                <w:szCs w:val="20"/>
+              </w:rPr>
+              <w:t>Faculty of Engineering and</w:t>
+            </w:r>
+          </w:p>
+          <w:p>
+            <w:pPr>
+              <w:pStyle w:val="Heading1"/>
+              <w:spacing w:before="0" w:after="0"/>
+              <w:jc w:val="center"/>
+              <w:rPr>
+                <w:rFonts w:ascii="Times New Roman" w:hAnsi="Times New Roman" w:cs="Times New Roman"/>
+                <w:b w:val="0"/>
+                <w:bCs w:val="0"/>
+                <w:color w:val="auto"/>
+                <w:sz w:val="20"/>
+                <w:szCs w:val="20"/>
+              </w:rPr>
+            </w:pPr>
+            <w:r>
+              <w:rPr>
+                <w:rFonts w:ascii="Times New Roman" w:hAnsi="Times New Roman" w:cs="Times New Roman"/>
+                <w:b w:val="0"/>
+                <w:bCs w:val="0"/>
+                <w:color w:val="auto"/>
+                <w:sz w:val="20"/>
+                <w:szCs w:val="20"/>
+              </w:rPr>
+              <w:t>Technology, Jain University,</w:t>
+            </w:r>
+          </w:p>
+          <w:p>
+            <w:pPr>
+              <w:pStyle w:val="Heading1"/>
+              <w:spacing w:before="0" w:after="0"/>
+              <w:jc w:val="center"/>
+              <w:rPr>
+                <w:rFonts w:ascii="Times New Roman" w:hAnsi="Times New Roman" w:cs="Times New Roman"/>
+                <w:color w:val="auto"/>
+              </w:rPr>
+            </w:pPr>
+            <w:r>
+              <w:rPr>
+                <w:rFonts w:ascii="Times New Roman" w:hAnsi="Times New Roman" w:cs="Times New Roman"/>
+                <w:b w:val="0"/>
+                <w:bCs w:val="0"/>
+                <w:color w:val="auto"/>
+                <w:sz w:val="20"/>
+                <w:szCs w:val="20"/>
+              </w:rPr>
+              <w:t>Bengaluru, Karnataka, India</w:t>
+            </w:r>
+          </w:p>
+        </w:tc>
+      </w:tr>
+      <w:tr>
+        <w:trPr>
+          <w:trHeight w:val="1700"/>
+          <w:jc w:val="right"/>
+        </w:trPr>
+        <w:tc>
+          <w:tcPr>
+            <w:tcW w:w="3236" w:type="dxa"/>
+          </w:tcPr>
+          <w:p>
+            <w:pPr>
+              <w:pStyle w:val="Heading1"/>
+              <w:spacing w:before="0" w:after="0"/>
+              <w:jc w:val="center"/>
+              <w:rPr>
+                <w:rFonts w:ascii="Times New Roman" w:hAnsi="Times New Roman" w:cs="Times New Roman"/>
+                <w:b w:val="0"/>
+                <w:bCs w:val="0"/>
+                <w:color w:val="auto"/>
+                <w:sz w:val="24"/>
+                <w:szCs w:val="24"/>
+              </w:rPr>
+            </w:pPr>
+            <w:r>
+              <w:rPr>
+                <w:rFonts w:ascii="Times New Roman" w:hAnsi="Times New Roman" w:cs="Times New Roman"/>
+                <w:b w:val="0"/>
+                <w:bCs w:val="0"/>
+                <w:color w:val="auto"/>
+                <w:sz w:val="24"/>
+                <w:szCs w:val="24"/>
+              </w:rPr>
+              <w:t>Aryan Agrawal</w:t>
+            </w:r>
+          </w:p>
+          <w:p>
+            <w:pPr>
+              <w:pStyle w:val="Heading1"/>
+              <w:spacing w:before="0" w:after="0"/>
+              <w:jc w:val="center"/>
+              <w:rPr>
+                <w:rFonts w:ascii="Times New Roman" w:hAnsi="Times New Roman" w:cs="Times New Roman"/>
+                <w:b w:val="0"/>
+                <w:bCs w:val="0"/>
+                <w:color w:val="auto"/>
+                <w:sz w:val="20"/>
+                <w:szCs w:val="20"/>
+              </w:rPr>
+            </w:pPr>
+            <w:r>
+              <w:rPr>
+                <w:rFonts w:ascii="Times New Roman" w:hAnsi="Times New Roman" w:cs="Times New Roman"/>
+                <w:b w:val="0"/>
+                <w:bCs w:val="0"/>
+                <w:color w:val="auto"/>
+                <w:sz w:val="20"/>
+                <w:szCs w:val="20"/>
+              </w:rPr>
+              <w:t>Department of Computer Science</w:t>
+            </w:r>
+          </w:p>
+          <w:p>
+            <w:pPr>
+              <w:pStyle w:val="Heading1"/>
+              <w:spacing w:before="0" w:after="0"/>
+              <w:jc w:val="center"/>
+              <w:rPr>
+                <w:rFonts w:ascii="Times New Roman" w:hAnsi="Times New Roman" w:cs="Times New Roman"/>
+                <w:b w:val="0"/>
+                <w:bCs w:val="0"/>
+                <w:color w:val="auto"/>
+                <w:sz w:val="20"/>
+                <w:szCs w:val="20"/>
+              </w:rPr>
+            </w:pPr>
+            <w:r>
+              <w:rPr>
+                <w:rFonts w:ascii="Times New Roman" w:hAnsi="Times New Roman" w:cs="Times New Roman"/>
+                <w:b w:val="0"/>
+                <w:bCs w:val="0"/>
+                <w:color w:val="auto"/>
+                <w:sz w:val="20"/>
+                <w:szCs w:val="20"/>
+              </w:rPr>
+              <w:t>and Engineering,</w:t>
+            </w:r>
+          </w:p>
+          <w:p>
+            <w:pPr>
+              <w:pStyle w:val="Heading1"/>
+              <w:spacing w:before="0" w:after="0"/>
+              <w:jc w:val="center"/>
+              <w:rPr>
+                <w:rFonts w:ascii="Times New Roman" w:hAnsi="Times New Roman" w:cs="Times New Roman"/>
+                <w:b w:val="0"/>
+                <w:bCs w:val="0"/>
+                <w:color w:val="auto"/>
+                <w:sz w:val="20"/>
+                <w:szCs w:val="20"/>
+              </w:rPr>
+            </w:pPr>
+            <w:r>
+              <w:rPr>
+                <w:rFonts w:ascii="Times New Roman" w:hAnsi="Times New Roman" w:cs="Times New Roman"/>
+                <w:b w:val="0"/>
+                <w:bCs w:val="0"/>
+                <w:color w:val="auto"/>
+                <w:sz w:val="20"/>
+                <w:szCs w:val="20"/>
+              </w:rPr>
+              <w:t>Faculty of Engineering and</w:t>
+            </w:r>
+          </w:p>
+          <w:p>
+            <w:pPr>
+              <w:pStyle w:val="Heading1"/>
+              <w:spacing w:before="0" w:after="0"/>
+              <w:jc w:val="center"/>
+              <w:rPr>
+                <w:rFonts w:ascii="Times New Roman" w:hAnsi="Times New Roman" w:cs="Times New Roman"/>
+                <w:b w:val="0"/>
+                <w:bCs w:val="0"/>
+                <w:color w:val="auto"/>
+                <w:sz w:val="20"/>
+                <w:szCs w:val="20"/>
+              </w:rPr>
+            </w:pPr>
+            <w:r>
+              <w:rPr>
+                <w:rFonts w:ascii="Times New Roman" w:hAnsi="Times New Roman" w:cs="Times New Roman"/>
+                <w:b w:val="0"/>
+                <w:bCs w:val="0"/>
+                <w:color w:val="auto"/>
+                <w:sz w:val="20"/>
+                <w:szCs w:val="20"/>
+              </w:rPr>
+              <w:t>Technology, Jain University,</w:t>
+            </w:r>
+          </w:p>
+          <w:p>
+            <w:pPr>
+              <w:pStyle w:val="Heading1"/>
+              <w:spacing w:before="0" w:after="0"/>
+              <w:jc w:val="center"/>
+              <w:rPr>
+                <w:rFonts w:ascii="Times New Roman" w:hAnsi="Times New Roman" w:cs="Times New Roman"/>
+                <w:color w:val="auto"/>
+              </w:rPr>
+            </w:pPr>
+            <w:r>
+              <w:rPr>
+                <w:rFonts w:ascii="Times New Roman" w:hAnsi="Times New Roman" w:cs="Times New Roman"/>
+                <w:b w:val="0"/>
+                <w:bCs w:val="0"/>
+                <w:color w:val="auto"/>
+                <w:sz w:val="20"/>
+                <w:szCs w:val="20"/>
+              </w:rPr>
+              <w:t>Bengaluru, Karnataka, India</w:t>
+            </w:r>
+          </w:p>
+        </w:tc>
+        <w:tc>
+          <w:tcPr>
+            <w:tcW w:w="3237" w:type="dxa"/>
+          </w:tcPr>
+          <w:p>
+            <w:pPr>
+              <w:pStyle w:val="Heading1"/>
+              <w:spacing w:before="0" w:after="0"/>
+              <w:jc w:val="center"/>
+              <w:rPr>
+                <w:rFonts w:ascii="Times New Roman" w:hAnsi="Times New Roman" w:cs="Times New Roman"/>
+                <w:b w:val="0"/>
+                <w:bCs w:val="0"/>
+                <w:color w:val="auto"/>
+                <w:sz w:val="24"/>
+                <w:szCs w:val="24"/>
+              </w:rPr>
+            </w:pPr>
+            <w:r>
+              <w:rPr>
+                <w:rFonts w:ascii="Times New Roman" w:hAnsi="Times New Roman" w:cs="Times New Roman"/>
+                <w:b w:val="0"/>
+                <w:bCs w:val="0"/>
+                <w:color w:val="auto"/>
+                <w:sz w:val="24"/>
+                <w:szCs w:val="24"/>
+              </w:rPr>
+              <w:t xml:space="preserve">Devansh </w:t>
+            </w:r>
+            <w:r>
+              <w:rPr>
+                <w:rFonts w:ascii="Times New Roman" w:hAnsi="Times New Roman" w:cs="Times New Roman"/>
+                <w:b w:val="0"/>
+                <w:bCs w:val="0"/>
+                <w:color w:val="auto"/>
+                <w:sz w:val="24"/>
+                <w:szCs w:val="24"/>
+              </w:rPr>
+              <w:t>G</w:t>
+            </w:r>
+            <w:r>
+              <w:rPr>
+                <w:rFonts w:ascii="Times New Roman" w:hAnsi="Times New Roman" w:cs="Times New Roman"/>
+                <w:b w:val="0"/>
+                <w:bCs w:val="0"/>
+                <w:color w:val="auto"/>
+                <w:sz w:val="24"/>
+                <w:szCs w:val="24"/>
+              </w:rPr>
+              <w:t>upta M</w:t>
+            </w:r>
+          </w:p>
+          <w:p>
+            <w:pPr>
+              <w:pStyle w:val="Heading1"/>
+              <w:spacing w:before="0" w:after="0"/>
+              <w:jc w:val="center"/>
+              <w:rPr>
+                <w:rFonts w:ascii="Times New Roman" w:hAnsi="Times New Roman" w:cs="Times New Roman"/>
+                <w:b w:val="0"/>
+                <w:bCs w:val="0"/>
+                <w:color w:val="auto"/>
+                <w:sz w:val="20"/>
+                <w:szCs w:val="20"/>
+              </w:rPr>
+            </w:pPr>
+            <w:r>
+              <w:rPr>
+                <w:rFonts w:ascii="Times New Roman" w:hAnsi="Times New Roman" w:cs="Times New Roman"/>
+                <w:b w:val="0"/>
+                <w:bCs w:val="0"/>
+                <w:color w:val="auto"/>
+                <w:sz w:val="20"/>
+                <w:szCs w:val="20"/>
+              </w:rPr>
+              <w:t>Department of Computer Science</w:t>
+            </w:r>
+          </w:p>
+          <w:p>
+            <w:pPr>
+              <w:pStyle w:val="Heading1"/>
+              <w:spacing w:before="0" w:after="0"/>
+              <w:jc w:val="center"/>
+              <w:rPr>
+                <w:rFonts w:ascii="Times New Roman" w:hAnsi="Times New Roman" w:cs="Times New Roman"/>
+                <w:b w:val="0"/>
+                <w:bCs w:val="0"/>
+                <w:color w:val="auto"/>
+                <w:sz w:val="20"/>
+                <w:szCs w:val="20"/>
+              </w:rPr>
+            </w:pPr>
+            <w:r>
+              <w:rPr>
+                <w:rFonts w:ascii="Times New Roman" w:hAnsi="Times New Roman" w:cs="Times New Roman"/>
+                <w:b w:val="0"/>
+                <w:bCs w:val="0"/>
+                <w:color w:val="auto"/>
+                <w:sz w:val="20"/>
+                <w:szCs w:val="20"/>
+              </w:rPr>
+              <w:t>and Engineering,</w:t>
+            </w:r>
+          </w:p>
+          <w:p>
+            <w:pPr>
+              <w:pStyle w:val="Heading1"/>
+              <w:spacing w:before="0" w:after="0"/>
+              <w:jc w:val="center"/>
+              <w:rPr>
+                <w:rFonts w:ascii="Times New Roman" w:hAnsi="Times New Roman" w:cs="Times New Roman"/>
+                <w:b w:val="0"/>
+                <w:bCs w:val="0"/>
+                <w:color w:val="auto"/>
+                <w:sz w:val="20"/>
+                <w:szCs w:val="20"/>
+              </w:rPr>
+            </w:pPr>
+            <w:r>
+              <w:rPr>
+                <w:rFonts w:ascii="Times New Roman" w:hAnsi="Times New Roman" w:cs="Times New Roman"/>
+                <w:b w:val="0"/>
+                <w:bCs w:val="0"/>
+                <w:color w:val="auto"/>
+                <w:sz w:val="20"/>
+                <w:szCs w:val="20"/>
+              </w:rPr>
+              <w:t>Faculty of Engineering and</w:t>
+            </w:r>
+          </w:p>
+          <w:p>
+            <w:pPr>
+              <w:pStyle w:val="Heading1"/>
+              <w:spacing w:before="0" w:after="0"/>
+              <w:jc w:val="center"/>
+              <w:rPr>
+                <w:rFonts w:ascii="Times New Roman" w:hAnsi="Times New Roman" w:cs="Times New Roman"/>
+                <w:b w:val="0"/>
+                <w:bCs w:val="0"/>
+                <w:color w:val="auto"/>
+                <w:sz w:val="20"/>
+                <w:szCs w:val="20"/>
+              </w:rPr>
+            </w:pPr>
+            <w:r>
+              <w:rPr>
+                <w:rFonts w:ascii="Times New Roman" w:hAnsi="Times New Roman" w:cs="Times New Roman"/>
+                <w:b w:val="0"/>
+                <w:bCs w:val="0"/>
+                <w:color w:val="auto"/>
+                <w:sz w:val="20"/>
+                <w:szCs w:val="20"/>
+              </w:rPr>
+              <w:t>Technology, Jain University,</w:t>
+            </w:r>
+          </w:p>
+          <w:p>
+            <w:pPr>
+              <w:pStyle w:val="Heading1"/>
+              <w:spacing w:before="0" w:after="0"/>
+              <w:jc w:val="center"/>
+              <w:rPr>
+                <w:rFonts w:ascii="Times New Roman" w:hAnsi="Times New Roman" w:cs="Times New Roman"/>
+                <w:color w:val="auto"/>
+              </w:rPr>
+            </w:pPr>
+            <w:r>
+              <w:rPr>
+                <w:rFonts w:ascii="Times New Roman" w:hAnsi="Times New Roman" w:cs="Times New Roman"/>
+                <w:b w:val="0"/>
+                <w:bCs w:val="0"/>
+                <w:color w:val="auto"/>
+                <w:sz w:val="20"/>
+                <w:szCs w:val="20"/>
+              </w:rPr>
+              <w:t>Bengaluru, Karnataka, India</w:t>
+            </w:r>
+          </w:p>
+        </w:tc>
+        <w:tc>
+          <w:tcPr>
+            <w:tcW w:w="3237" w:type="dxa"/>
+          </w:tcPr>
+          <w:p>
+            <w:pPr>
+              <w:pStyle w:val="Heading1"/>
+              <w:spacing w:before="0" w:after="0"/>
+              <w:jc w:val="center"/>
+              <w:rPr>
+                <w:rFonts w:ascii="Times New Roman" w:hAnsi="Times New Roman" w:cs="Times New Roman"/>
+                <w:b w:val="0"/>
+                <w:bCs w:val="0"/>
+                <w:color w:val="auto"/>
+                <w:sz w:val="24"/>
+                <w:szCs w:val="24"/>
+              </w:rPr>
+            </w:pPr>
+            <w:r>
+              <w:rPr>
+                <w:rFonts w:ascii="Times New Roman" w:hAnsi="Times New Roman" w:cs="Times New Roman"/>
+                <w:b w:val="0"/>
+                <w:bCs w:val="0"/>
+                <w:color w:val="auto"/>
+                <w:sz w:val="24"/>
+                <w:szCs w:val="24"/>
+              </w:rPr>
+              <w:t>Druvraaj</w:t>
+            </w:r>
+          </w:p>
+          <w:p>
+            <w:pPr>
+              <w:pStyle w:val="Heading1"/>
+              <w:spacing w:before="0" w:after="0"/>
+              <w:jc w:val="center"/>
+              <w:rPr>
+                <w:rFonts w:ascii="Times New Roman" w:hAnsi="Times New Roman" w:cs="Times New Roman"/>
+                <w:b w:val="0"/>
+                <w:bCs w:val="0"/>
+                <w:color w:val="auto"/>
+                <w:sz w:val="20"/>
+                <w:szCs w:val="20"/>
+              </w:rPr>
+            </w:pPr>
+            <w:r>
+              <w:rPr>
+                <w:rFonts w:ascii="Times New Roman" w:hAnsi="Times New Roman" w:cs="Times New Roman"/>
+                <w:b w:val="0"/>
+                <w:bCs w:val="0"/>
+                <w:color w:val="auto"/>
+                <w:sz w:val="20"/>
+                <w:szCs w:val="20"/>
+              </w:rPr>
+              <w:t>Department of Computer Science</w:t>
+            </w:r>
+          </w:p>
+          <w:p>
+            <w:pPr>
+              <w:pStyle w:val="Heading1"/>
+              <w:spacing w:before="0" w:after="0"/>
+              <w:jc w:val="center"/>
+              <w:rPr>
+                <w:rFonts w:ascii="Times New Roman" w:hAnsi="Times New Roman" w:cs="Times New Roman"/>
+                <w:b w:val="0"/>
+                <w:bCs w:val="0"/>
+                <w:color w:val="auto"/>
+                <w:sz w:val="20"/>
+                <w:szCs w:val="20"/>
+              </w:rPr>
+            </w:pPr>
+            <w:r>
+              <w:rPr>
+                <w:rFonts w:ascii="Times New Roman" w:hAnsi="Times New Roman" w:cs="Times New Roman"/>
+                <w:b w:val="0"/>
+                <w:bCs w:val="0"/>
+                <w:color w:val="auto"/>
+                <w:sz w:val="20"/>
+                <w:szCs w:val="20"/>
+              </w:rPr>
+              <w:t>and Engineering,</w:t>
+            </w:r>
+          </w:p>
+          <w:p>
+            <w:pPr>
+              <w:pStyle w:val="Heading1"/>
+              <w:spacing w:before="0" w:after="0"/>
+              <w:jc w:val="center"/>
+              <w:rPr>
+                <w:rFonts w:ascii="Times New Roman" w:hAnsi="Times New Roman" w:cs="Times New Roman"/>
+                <w:b w:val="0"/>
+                <w:bCs w:val="0"/>
+                <w:color w:val="auto"/>
+                <w:sz w:val="20"/>
+                <w:szCs w:val="20"/>
+              </w:rPr>
+            </w:pPr>
+            <w:r>
+              <w:rPr>
+                <w:rFonts w:ascii="Times New Roman" w:hAnsi="Times New Roman" w:cs="Times New Roman"/>
+                <w:b w:val="0"/>
+                <w:bCs w:val="0"/>
+                <w:color w:val="auto"/>
+                <w:sz w:val="20"/>
+                <w:szCs w:val="20"/>
+              </w:rPr>
+              <w:t>Faculty of Engineering and</w:t>
+            </w:r>
+          </w:p>
+          <w:p>
+            <w:pPr>
+              <w:pStyle w:val="Heading1"/>
+              <w:spacing w:before="0" w:after="0"/>
+              <w:jc w:val="center"/>
+              <w:rPr>
+                <w:rFonts w:ascii="Times New Roman" w:hAnsi="Times New Roman" w:cs="Times New Roman"/>
+                <w:b w:val="0"/>
+                <w:bCs w:val="0"/>
+                <w:color w:val="auto"/>
+                <w:sz w:val="20"/>
+                <w:szCs w:val="20"/>
+              </w:rPr>
+            </w:pPr>
+            <w:r>
+              <w:rPr>
+                <w:rFonts w:ascii="Times New Roman" w:hAnsi="Times New Roman" w:cs="Times New Roman"/>
+                <w:b w:val="0"/>
+                <w:bCs w:val="0"/>
+                <w:color w:val="auto"/>
+                <w:sz w:val="20"/>
+                <w:szCs w:val="20"/>
+              </w:rPr>
+              <w:t>Technology, Jain University,</w:t>
+            </w:r>
+          </w:p>
+          <w:p>
+            <w:pPr>
+              <w:pStyle w:val="Heading1"/>
+              <w:spacing w:before="0" w:after="0"/>
+              <w:jc w:val="center"/>
+              <w:rPr>
+                <w:rFonts w:ascii="Times New Roman" w:hAnsi="Times New Roman" w:cs="Times New Roman"/>
+                <w:color w:val="auto"/>
+              </w:rPr>
+            </w:pPr>
+            <w:r>
+              <w:rPr>
+                <w:rFonts w:ascii="Times New Roman" w:hAnsi="Times New Roman" w:cs="Times New Roman"/>
+                <w:b w:val="0"/>
+                <w:bCs w:val="0"/>
+                <w:color w:val="auto"/>
+                <w:sz w:val="20"/>
+                <w:szCs w:val="20"/>
+              </w:rPr>
+              <w:t>Bengaluru, Karnataka, India</w:t>
+            </w:r>
+          </w:p>
+        </w:tc>
+      </w:tr>
+      <w:tr>
+        <w:trPr>
+          <w:jc w:val="right"/>
+        </w:trPr>
+        <w:tc>
+          <w:tcPr>
+            <w:tcW w:w="3236" w:type="dxa"/>
+          </w:tcPr>
+          <w:p>
+            <w:pPr>
+              <w:pStyle w:val="Heading1"/>
+              <w:spacing w:before="0" w:after="0"/>
+              <w:jc w:val="center"/>
               <w:rPr>
                 <w:rFonts w:ascii="Times New Roman" w:hAnsi="Times New Roman" w:cs="Times New Roman"/>
                 <w:b w:val="0"/>
@@ -63,45 +1064,106 @@
                 <w:szCs w:val="28"/>
               </w:rPr>
             </w:pPr>
-            <w:r>
+          </w:p>
+        </w:tc>
+        <w:tc>
+          <w:tcPr>
+            <w:tcW w:w="3237" w:type="dxa"/>
+          </w:tcPr>
+          <w:p>
+            <w:pPr>
+              <w:pStyle w:val="Heading1"/>
+              <w:spacing w:before="0" w:after="0"/>
+              <w:jc w:val="center"/>
               <w:rPr>
                 <w:rFonts w:ascii="Times New Roman" w:hAnsi="Times New Roman" w:cs="Times New Roman"/>
                 <w:b w:val="0"/>
                 <w:bCs w:val="0"/>
                 <w:color w:val="auto"/>
-                <w:sz w:val="28"/>
-                <w:szCs w:val="28"/>
-              </w:rPr>
-              <w:t xml:space="preserve">      </w:t>
-            </w:r>
+                <w:sz w:val="24"/>
+                <w:szCs w:val="24"/>
+              </w:rPr>
+            </w:pPr>
+            <w:proofErr w:type="spellStart"/>
             <w:r>
               <w:rPr>
                 <w:rFonts w:ascii="Times New Roman" w:hAnsi="Times New Roman" w:cs="Times New Roman"/>
                 <w:b w:val="0"/>
                 <w:bCs w:val="0"/>
                 <w:color w:val="auto"/>
-                <w:sz w:val="28"/>
-                <w:szCs w:val="28"/>
-              </w:rPr>
-              <w:t>Akash S</w:t>
-            </w:r>
+                <w:sz w:val="24"/>
+                <w:szCs w:val="24"/>
+              </w:rPr>
+              <w:t>Dr.</w:t>
+            </w:r>
+            <w:proofErr w:type="spellEnd"/>
             <w:r>
               <w:rPr>
                 <w:rFonts w:ascii="Times New Roman" w:hAnsi="Times New Roman" w:cs="Times New Roman"/>
                 <w:b w:val="0"/>
                 <w:bCs w:val="0"/>
                 <w:color w:val="auto"/>
-                <w:sz w:val="28"/>
-                <w:szCs w:val="28"/>
-              </w:rPr>
-              <w:t>M</w:t>
+                <w:sz w:val="24"/>
+                <w:szCs w:val="24"/>
+              </w:rPr>
+              <w:t xml:space="preserve"> </w:t>
+            </w:r>
+            <w:proofErr w:type="spellStart"/>
+            <w:r>
+              <w:rPr>
+                <w:rFonts w:ascii="Times New Roman" w:hAnsi="Times New Roman" w:cs="Times New Roman"/>
+                <w:b w:val="0"/>
+                <w:bCs w:val="0"/>
+                <w:color w:val="auto"/>
+                <w:sz w:val="24"/>
+                <w:szCs w:val="24"/>
+              </w:rPr>
+              <w:t>Renukadevi</w:t>
+            </w:r>
+            <w:proofErr w:type="spellEnd"/>
+            <w:r>
+              <w:rPr>
+                <w:rFonts w:ascii="Times New Roman" w:hAnsi="Times New Roman" w:cs="Times New Roman"/>
+                <w:b w:val="0"/>
+                <w:bCs w:val="0"/>
+                <w:color w:val="auto"/>
+                <w:sz w:val="24"/>
+                <w:szCs w:val="24"/>
+              </w:rPr>
+              <w:t xml:space="preserve"> P</w:t>
             </w:r>
           </w:p>
           <w:p>
             <w:pPr>
               <w:pStyle w:val="Heading1"/>
               <w:spacing w:before="0" w:after="0"/>
-              <w:jc w:val="both"/>
+              <w:jc w:val="center"/>
+              <w:rPr>
+                <w:rFonts w:ascii="Times New Roman" w:hAnsi="Times New Roman" w:cs="Times New Roman"/>
+                <w:b w:val="0"/>
+                <w:bCs w:val="0"/>
+                <w:color w:val="auto"/>
+                <w:sz w:val="24"/>
+                <w:szCs w:val="24"/>
+              </w:rPr>
+            </w:pPr>
+            <w:r>
+              <w:rPr>
+                <w:rFonts w:ascii="Times New Roman" w:hAnsi="Times New Roman" w:cs="Times New Roman"/>
+                <w:b w:val="0"/>
+                <w:bCs w:val="0"/>
+                <w:color w:val="auto"/>
+                <w:sz w:val="24"/>
+                <w:szCs w:val="24"/>
+              </w:rPr>
+              <w:t>Assistant professor,</w:t>
+            </w:r>
+          </w:p>
+          <w:p>
+            <w:pPr>
+              <w:pStyle w:val="Heading1"/>
+              <w:spacing w:before="0" w:after="0"/>
+              <w:jc w:val="center"/>
               <w:rPr>
                 <w:rFonts w:ascii="Times New Roman" w:hAnsi="Times New Roman" w:cs="Times New Roman"/>
                 <w:b w:val="0"/>
@@ -127,7 +1189,7 @@
             <w:pPr>
               <w:pStyle w:val="Heading1"/>
               <w:spacing w:before="0" w:after="0"/>
-              <w:jc w:val="both"/>
+              <w:jc w:val="center"/>
               <w:rPr>
                 <w:rFonts w:ascii="Times New Roman" w:hAnsi="Times New Roman" w:cs="Times New Roman"/>
                 <w:b w:val="0"/>
@@ -146,9 +1208,14 @@
                 <w:sz w:val="20"/>
                 <w:szCs w:val="20"/>
               </w:rPr>
-              <w:t xml:space="preserve">       </w:t>
-            </w:r>
-            <w:r>
+              <w:t>and Engineering,</w:t>
+            </w:r>
+          </w:p>
+          <w:p>
+            <w:pPr>
+              <w:pStyle w:val="Heading1"/>
+              <w:spacing w:before="0" w:after="0"/>
+              <w:jc w:val="center"/>
               <w:rPr>
                 <w:rFonts w:ascii="Times New Roman" w:hAnsi="Times New Roman" w:cs="Times New Roman"/>
                 <w:b w:val="0"/>
@@ -157,8 +1224,7 @@
                 <w:sz w:val="20"/>
                 <w:szCs w:val="20"/>
               </w:rPr>
-              <w:t xml:space="preserve">  </w:t>
-            </w:r>
+            </w:pPr>
             <w:r>
               <w:rPr>
                 <w:rFonts w:ascii="Times New Roman" w:hAnsi="Times New Roman" w:cs="Times New Roman"/>
@@ -168,14 +1234,14 @@
                 <w:sz w:val="20"/>
                 <w:szCs w:val="20"/>
               </w:rPr>
-              <w:t>and Engineering,</w:t>
+              <w:t>Faculty of Engineering and</w:t>
             </w:r>
           </w:p>
           <w:p>
             <w:pPr>
               <w:pStyle w:val="Heading1"/>
               <w:spacing w:before="0" w:after="0"/>
-              <w:jc w:val="both"/>
+              <w:jc w:val="center"/>
               <w:rPr>
                 <w:rFonts w:ascii="Times New Roman" w:hAnsi="Times New Roman" w:cs="Times New Roman"/>
                 <w:b w:val="0"/>
@@ -194,9 +1260,14 @@
                 <w:sz w:val="20"/>
                 <w:szCs w:val="20"/>
               </w:rPr>
-              <w:t xml:space="preserve">   </w:t>
-            </w:r>
-            <w:r>
+              <w:t>Technology, Jain University,</w:t>
+            </w:r>
+          </w:p>
+          <w:p>
+            <w:pPr>
+              <w:pStyle w:val="Heading1"/>
+              <w:spacing w:before="0" w:after="0"/>
+              <w:jc w:val="center"/>
               <w:rPr>
                 <w:rFonts w:ascii="Times New Roman" w:hAnsi="Times New Roman" w:cs="Times New Roman"/>
                 <w:b w:val="0"/>
@@ -205,14 +1276,8 @@
                 <w:sz w:val="20"/>
                 <w:szCs w:val="20"/>
               </w:rPr>
-              <w:t>Faculty of Engineering and</w:t>
-            </w:r>
-          </w:p>
-          <w:p>
-            <w:pPr>
-              <w:pStyle w:val="Heading1"/>
-              <w:spacing w:before="0" w:after="0"/>
-              <w:jc w:val="both"/>
+            </w:pPr>
+            <w:r>
               <w:rPr>
                 <w:rFonts w:ascii="Times New Roman" w:hAnsi="Times New Roman" w:cs="Times New Roman"/>
                 <w:b w:val="0"/>
@@ -221,1322 +1286,37 @@
                 <w:sz w:val="20"/>
                 <w:szCs w:val="20"/>
               </w:rPr>
-            </w:pPr>
-            <w:r>
-              <w:rPr>
-                <w:rFonts w:ascii="Times New Roman" w:hAnsi="Times New Roman" w:cs="Times New Roman"/>
-                <w:b w:val="0"/>
-                <w:bCs w:val="0"/>
-                <w:color w:val="auto"/>
-                <w:sz w:val="20"/>
-                <w:szCs w:val="20"/>
-              </w:rPr>
-              <w:t xml:space="preserve">  </w:t>
-            </w:r>
-            <w:r>
-              <w:rPr>
-                <w:rFonts w:ascii="Times New Roman" w:hAnsi="Times New Roman" w:cs="Times New Roman"/>
-                <w:b w:val="0"/>
-                <w:bCs w:val="0"/>
-                <w:color w:val="auto"/>
-                <w:sz w:val="20"/>
-                <w:szCs w:val="20"/>
-              </w:rPr>
-              <w:t>Technology, Jain University,</w:t>
+              <w:t>Bengaluru, Karnataka, India</w:t>
             </w:r>
           </w:p>
           <w:p>
             <w:pPr>
               <w:pStyle w:val="Heading1"/>
               <w:spacing w:before="0" w:after="0"/>
-              <w:jc w:val="both"/>
-              <w:rPr>
-                <w:rFonts w:ascii="Times New Roman" w:hAnsi="Times New Roman" w:cs="Times New Roman"/>
-                <w:b w:val="0"/>
-                <w:bCs w:val="0"/>
-                <w:color w:val="auto"/>
-                <w:sz w:val="20"/>
-                <w:szCs w:val="20"/>
-              </w:rPr>
-            </w:pPr>
-            <w:r>
-              <w:rPr>
-                <w:rFonts w:ascii="Times New Roman" w:hAnsi="Times New Roman" w:cs="Times New Roman"/>
-                <w:b w:val="0"/>
-                <w:bCs w:val="0"/>
-                <w:color w:val="auto"/>
-                <w:sz w:val="20"/>
-                <w:szCs w:val="20"/>
-              </w:rPr>
-              <w:t xml:space="preserve">  </w:t>
-            </w:r>
-            <w:r>
-              <w:rPr>
-                <w:rFonts w:ascii="Times New Roman" w:hAnsi="Times New Roman" w:cs="Times New Roman"/>
-                <w:b w:val="0"/>
-                <w:bCs w:val="0"/>
-                <w:color w:val="auto"/>
-                <w:sz w:val="20"/>
-                <w:szCs w:val="20"/>
-              </w:rPr>
-              <w:t>Bengaluru, Karnataka, India</w:t>
-            </w:r>
-          </w:p>
-          <w:p>
-            <w:pPr>
-              <w:pStyle w:val="Heading1"/>
-              <w:spacing w:before="0" w:after="0"/>
-              <w:jc w:val="both"/>
-              <w:rPr>
-                <w:rFonts w:ascii="Times New Roman" w:hAnsi="Times New Roman" w:cs="Times New Roman"/>
-                <w:color w:val="auto"/>
-              </w:rPr>
-            </w:pPr>
-          </w:p>
-        </w:tc>
-        <w:tc>
-          <w:tcPr>
-            <w:tcW w:w="3237" w:type="dxa"/>
-          </w:tcPr>
-          <w:p>
-            <w:pPr>
-              <w:pStyle w:val="Heading1"/>
-              <w:spacing w:before="0" w:after="0"/>
-              <w:jc w:val="both"/>
-              <w:rPr>
-                <w:rFonts w:ascii="Times New Roman" w:hAnsi="Times New Roman" w:cs="Times New Roman"/>
-                <w:b w:val="0"/>
-                <w:bCs w:val="0"/>
-                <w:color w:val="auto"/>
-                <w:sz w:val="28"/>
-                <w:szCs w:val="28"/>
-              </w:rPr>
-            </w:pPr>
-            <w:r>
-              <w:rPr>
-                <w:rFonts w:ascii="Times New Roman" w:hAnsi="Times New Roman" w:cs="Times New Roman"/>
-                <w:color w:val="auto"/>
-              </w:rPr>
-              <w:t xml:space="preserve">   </w:t>
-            </w:r>
-            <w:r>
-              <w:rPr>
-                <w:rFonts w:ascii="Times New Roman" w:hAnsi="Times New Roman" w:cs="Times New Roman"/>
-                <w:color w:val="auto"/>
-              </w:rPr>
-              <w:t xml:space="preserve">  </w:t>
-            </w:r>
-            <w:r>
-              <w:rPr>
-                <w:rFonts w:ascii="Times New Roman" w:hAnsi="Times New Roman" w:cs="Times New Roman"/>
-                <w:b w:val="0"/>
-                <w:bCs w:val="0"/>
-                <w:color w:val="auto"/>
-                <w:sz w:val="28"/>
-                <w:szCs w:val="28"/>
-              </w:rPr>
-              <w:t>Avinash GK</w:t>
-            </w:r>
-          </w:p>
-          <w:p>
-            <w:pPr>
-              <w:pStyle w:val="Heading1"/>
-              <w:spacing w:before="0" w:after="0"/>
-              <w:jc w:val="both"/>
-              <w:rPr>
-                <w:rFonts w:ascii="Times New Roman" w:hAnsi="Times New Roman" w:cs="Times New Roman"/>
-                <w:b w:val="0"/>
-                <w:bCs w:val="0"/>
-                <w:color w:val="auto"/>
-                <w:sz w:val="20"/>
-                <w:szCs w:val="20"/>
-              </w:rPr>
-            </w:pPr>
-            <w:r>
-              <w:rPr>
-                <w:rFonts w:ascii="Times New Roman" w:hAnsi="Times New Roman" w:cs="Times New Roman"/>
-                <w:b w:val="0"/>
-                <w:bCs w:val="0"/>
-                <w:color w:val="auto"/>
-                <w:sz w:val="20"/>
-                <w:szCs w:val="20"/>
-              </w:rPr>
-              <w:t>Department of Computer Science</w:t>
-            </w:r>
-          </w:p>
-          <w:p>
-            <w:pPr>
-              <w:pStyle w:val="Heading1"/>
-              <w:spacing w:before="0" w:after="0"/>
-              <w:jc w:val="both"/>
-              <w:rPr>
-                <w:rFonts w:ascii="Times New Roman" w:hAnsi="Times New Roman" w:cs="Times New Roman"/>
-                <w:b w:val="0"/>
-                <w:bCs w:val="0"/>
-                <w:color w:val="auto"/>
-                <w:sz w:val="20"/>
-                <w:szCs w:val="20"/>
-              </w:rPr>
-            </w:pPr>
-            <w:r>
-              <w:rPr>
-                <w:rFonts w:ascii="Times New Roman" w:hAnsi="Times New Roman" w:cs="Times New Roman"/>
-                <w:b w:val="0"/>
-                <w:bCs w:val="0"/>
-                <w:color w:val="auto"/>
-                <w:sz w:val="20"/>
-                <w:szCs w:val="20"/>
-              </w:rPr>
-              <w:t xml:space="preserve">        </w:t>
-            </w:r>
-            <w:r>
-              <w:rPr>
-                <w:rFonts w:ascii="Times New Roman" w:hAnsi="Times New Roman" w:cs="Times New Roman"/>
-                <w:b w:val="0"/>
-                <w:bCs w:val="0"/>
-                <w:color w:val="auto"/>
-                <w:sz w:val="20"/>
-                <w:szCs w:val="20"/>
-              </w:rPr>
-              <w:t xml:space="preserve">  </w:t>
-            </w:r>
-            <w:r>
-              <w:rPr>
-                <w:rFonts w:ascii="Times New Roman" w:hAnsi="Times New Roman" w:cs="Times New Roman"/>
-                <w:b w:val="0"/>
-                <w:bCs w:val="0"/>
-                <w:color w:val="auto"/>
-                <w:sz w:val="20"/>
-                <w:szCs w:val="20"/>
-              </w:rPr>
-              <w:t>and Engineering,</w:t>
-            </w:r>
-          </w:p>
-          <w:p>
-            <w:pPr>
-              <w:pStyle w:val="Heading1"/>
-              <w:spacing w:before="0" w:after="0"/>
-              <w:jc w:val="both"/>
-              <w:rPr>
-                <w:rFonts w:ascii="Times New Roman" w:hAnsi="Times New Roman" w:cs="Times New Roman"/>
-                <w:b w:val="0"/>
-                <w:bCs w:val="0"/>
-                <w:color w:val="auto"/>
-                <w:sz w:val="20"/>
-                <w:szCs w:val="20"/>
-              </w:rPr>
-            </w:pPr>
-            <w:r>
-              <w:rPr>
-                <w:rFonts w:ascii="Times New Roman" w:hAnsi="Times New Roman" w:cs="Times New Roman"/>
-                <w:b w:val="0"/>
-                <w:bCs w:val="0"/>
-                <w:color w:val="auto"/>
-                <w:sz w:val="20"/>
-                <w:szCs w:val="20"/>
-              </w:rPr>
-              <w:t xml:space="preserve">   </w:t>
-            </w:r>
-            <w:r>
-              <w:rPr>
-                <w:rFonts w:ascii="Times New Roman" w:hAnsi="Times New Roman" w:cs="Times New Roman"/>
-                <w:b w:val="0"/>
-                <w:bCs w:val="0"/>
-                <w:color w:val="auto"/>
-                <w:sz w:val="20"/>
-                <w:szCs w:val="20"/>
-              </w:rPr>
-              <w:t>Faculty of Engineering and</w:t>
-            </w:r>
-          </w:p>
-          <w:p>
-            <w:pPr>
-              <w:pStyle w:val="Heading1"/>
-              <w:spacing w:before="0" w:after="0"/>
-              <w:jc w:val="both"/>
-              <w:rPr>
-                <w:rFonts w:ascii="Times New Roman" w:hAnsi="Times New Roman" w:cs="Times New Roman"/>
-                <w:b w:val="0"/>
-                <w:bCs w:val="0"/>
-                <w:color w:val="auto"/>
-                <w:sz w:val="20"/>
-                <w:szCs w:val="20"/>
-              </w:rPr>
-            </w:pPr>
-            <w:r>
-              <w:rPr>
-                <w:rFonts w:ascii="Times New Roman" w:hAnsi="Times New Roman" w:cs="Times New Roman"/>
-                <w:b w:val="0"/>
-                <w:bCs w:val="0"/>
-                <w:color w:val="auto"/>
-                <w:sz w:val="20"/>
-                <w:szCs w:val="20"/>
-              </w:rPr>
-              <w:t xml:space="preserve">  </w:t>
-            </w:r>
-            <w:r>
-              <w:rPr>
-                <w:rFonts w:ascii="Times New Roman" w:hAnsi="Times New Roman" w:cs="Times New Roman"/>
-                <w:b w:val="0"/>
-                <w:bCs w:val="0"/>
-                <w:color w:val="auto"/>
-                <w:sz w:val="20"/>
-                <w:szCs w:val="20"/>
-              </w:rPr>
-              <w:t>Technology, Jain University,</w:t>
-            </w:r>
-          </w:p>
-          <w:p>
-            <w:pPr>
-              <w:pStyle w:val="Heading1"/>
-              <w:spacing w:before="0" w:after="0"/>
-              <w:jc w:val="both"/>
-              <w:rPr>
-                <w:rFonts w:ascii="Times New Roman" w:hAnsi="Times New Roman" w:cs="Times New Roman"/>
-                <w:color w:val="auto"/>
-              </w:rPr>
-            </w:pPr>
-            <w:r>
-              <w:rPr>
-                <w:rFonts w:ascii="Times New Roman" w:hAnsi="Times New Roman" w:cs="Times New Roman"/>
-                <w:b w:val="0"/>
-                <w:bCs w:val="0"/>
-                <w:color w:val="auto"/>
-                <w:sz w:val="20"/>
-                <w:szCs w:val="20"/>
-              </w:rPr>
-              <w:t xml:space="preserve">  </w:t>
-            </w:r>
-            <w:r>
-              <w:rPr>
-                <w:rFonts w:ascii="Times New Roman" w:hAnsi="Times New Roman" w:cs="Times New Roman"/>
-                <w:b w:val="0"/>
-                <w:bCs w:val="0"/>
-                <w:color w:val="auto"/>
-                <w:sz w:val="20"/>
-                <w:szCs w:val="20"/>
-              </w:rPr>
-              <w:t>Bengaluru, Karnataka, India</w:t>
-            </w:r>
-          </w:p>
-        </w:tc>
-        <w:tc>
-          <w:tcPr>
-            <w:tcW w:w="3237" w:type="dxa"/>
-          </w:tcPr>
-          <w:p>
-            <w:pPr>
-              <w:pStyle w:val="Heading1"/>
-              <w:spacing w:before="0" w:after="0"/>
-              <w:jc w:val="both"/>
-              <w:rPr>
-                <w:rFonts w:ascii="Times New Roman" w:hAnsi="Times New Roman" w:cs="Times New Roman"/>
-                <w:b w:val="0"/>
-                <w:bCs w:val="0"/>
-                <w:color w:val="auto"/>
-                <w:sz w:val="28"/>
-                <w:szCs w:val="28"/>
-              </w:rPr>
-            </w:pPr>
-            <w:r>
-              <w:rPr>
-                <w:rFonts w:ascii="Times New Roman" w:hAnsi="Times New Roman" w:cs="Times New Roman"/>
-                <w:color w:val="auto"/>
-                <w:sz w:val="28"/>
-                <w:szCs w:val="28"/>
-              </w:rPr>
-              <w:t xml:space="preserve">   </w:t>
-            </w:r>
-            <w:r>
-              <w:rPr>
-                <w:rFonts w:ascii="Times New Roman" w:hAnsi="Times New Roman" w:cs="Times New Roman"/>
-                <w:color w:val="auto"/>
-                <w:sz w:val="28"/>
-                <w:szCs w:val="28"/>
-              </w:rPr>
-              <w:t xml:space="preserve">     </w:t>
-            </w:r>
-            <w:r>
-              <w:rPr>
-                <w:rFonts w:ascii="Times New Roman" w:hAnsi="Times New Roman" w:cs="Times New Roman"/>
-                <w:b w:val="0"/>
-                <w:bCs w:val="0"/>
-                <w:color w:val="auto"/>
-                <w:sz w:val="28"/>
-                <w:szCs w:val="28"/>
-              </w:rPr>
-              <w:t>Aditya K</w:t>
-            </w:r>
-          </w:p>
-          <w:p>
-            <w:pPr>
-              <w:pStyle w:val="Heading1"/>
-              <w:spacing w:before="0" w:after="0"/>
-              <w:jc w:val="both"/>
-              <w:rPr>
-                <w:rFonts w:ascii="Times New Roman" w:hAnsi="Times New Roman" w:cs="Times New Roman"/>
-                <w:b w:val="0"/>
-                <w:bCs w:val="0"/>
-                <w:color w:val="auto"/>
-                <w:sz w:val="20"/>
-                <w:szCs w:val="20"/>
-              </w:rPr>
-            </w:pPr>
-            <w:r>
-              <w:rPr>
-                <w:rFonts w:ascii="Times New Roman" w:hAnsi="Times New Roman" w:cs="Times New Roman"/>
-                <w:b w:val="0"/>
-                <w:bCs w:val="0"/>
-                <w:color w:val="auto"/>
-                <w:sz w:val="20"/>
-                <w:szCs w:val="20"/>
-              </w:rPr>
-              <w:t>Department of Computer Science</w:t>
-            </w:r>
-          </w:p>
-          <w:p>
-            <w:pPr>
-              <w:pStyle w:val="Heading1"/>
-              <w:spacing w:before="0" w:after="0"/>
-              <w:jc w:val="both"/>
-              <w:rPr>
-                <w:rFonts w:ascii="Times New Roman" w:hAnsi="Times New Roman" w:cs="Times New Roman"/>
-                <w:b w:val="0"/>
-                <w:bCs w:val="0"/>
-                <w:color w:val="auto"/>
-                <w:sz w:val="20"/>
-                <w:szCs w:val="20"/>
-              </w:rPr>
-            </w:pPr>
-            <w:r>
-              <w:rPr>
-                <w:rFonts w:ascii="Times New Roman" w:hAnsi="Times New Roman" w:cs="Times New Roman"/>
-                <w:b w:val="0"/>
-                <w:bCs w:val="0"/>
-                <w:color w:val="auto"/>
-                <w:sz w:val="20"/>
-                <w:szCs w:val="20"/>
-              </w:rPr>
-              <w:t xml:space="preserve">     </w:t>
-            </w:r>
-            <w:r>
-              <w:rPr>
-                <w:rFonts w:ascii="Times New Roman" w:hAnsi="Times New Roman" w:cs="Times New Roman"/>
-                <w:b w:val="0"/>
-                <w:bCs w:val="0"/>
-                <w:color w:val="auto"/>
-                <w:sz w:val="20"/>
-                <w:szCs w:val="20"/>
-              </w:rPr>
-              <w:t xml:space="preserve"> </w:t>
-            </w:r>
-            <w:r>
-              <w:rPr>
-                <w:rFonts w:ascii="Times New Roman" w:hAnsi="Times New Roman" w:cs="Times New Roman"/>
-                <w:b w:val="0"/>
-                <w:bCs w:val="0"/>
-                <w:color w:val="auto"/>
-                <w:sz w:val="20"/>
-                <w:szCs w:val="20"/>
-              </w:rPr>
-              <w:t xml:space="preserve">  </w:t>
-            </w:r>
-            <w:r>
-              <w:rPr>
-                <w:rFonts w:ascii="Times New Roman" w:hAnsi="Times New Roman" w:cs="Times New Roman"/>
-                <w:b w:val="0"/>
-                <w:bCs w:val="0"/>
-                <w:color w:val="auto"/>
-                <w:sz w:val="20"/>
-                <w:szCs w:val="20"/>
-              </w:rPr>
-              <w:t xml:space="preserve"> </w:t>
-            </w:r>
-            <w:r>
-              <w:rPr>
-                <w:rFonts w:ascii="Times New Roman" w:hAnsi="Times New Roman" w:cs="Times New Roman"/>
-                <w:b w:val="0"/>
-                <w:bCs w:val="0"/>
-                <w:color w:val="auto"/>
-                <w:sz w:val="20"/>
-                <w:szCs w:val="20"/>
-              </w:rPr>
-              <w:t>and Engineering,</w:t>
-            </w:r>
-          </w:p>
-          <w:p>
-            <w:pPr>
-              <w:pStyle w:val="Heading1"/>
-              <w:spacing w:before="0" w:after="0"/>
-              <w:jc w:val="both"/>
-              <w:rPr>
-                <w:rFonts w:ascii="Times New Roman" w:hAnsi="Times New Roman" w:cs="Times New Roman"/>
-                <w:b w:val="0"/>
-                <w:bCs w:val="0"/>
-                <w:color w:val="auto"/>
-                <w:sz w:val="20"/>
-                <w:szCs w:val="20"/>
-              </w:rPr>
-            </w:pPr>
-            <w:r>
-              <w:rPr>
-                <w:rFonts w:ascii="Times New Roman" w:hAnsi="Times New Roman" w:cs="Times New Roman"/>
-                <w:b w:val="0"/>
-                <w:bCs w:val="0"/>
-                <w:color w:val="auto"/>
-                <w:sz w:val="20"/>
-                <w:szCs w:val="20"/>
-              </w:rPr>
-              <w:t xml:space="preserve">   </w:t>
-            </w:r>
-            <w:r>
-              <w:rPr>
-                <w:rFonts w:ascii="Times New Roman" w:hAnsi="Times New Roman" w:cs="Times New Roman"/>
-                <w:b w:val="0"/>
-                <w:bCs w:val="0"/>
-                <w:color w:val="auto"/>
-                <w:sz w:val="20"/>
-                <w:szCs w:val="20"/>
-              </w:rPr>
-              <w:t>Faculty of Engineering and</w:t>
-            </w:r>
-          </w:p>
-          <w:p>
-            <w:pPr>
-              <w:pStyle w:val="Heading1"/>
-              <w:spacing w:before="0" w:after="0"/>
-              <w:jc w:val="both"/>
-              <w:rPr>
-                <w:rFonts w:ascii="Times New Roman" w:hAnsi="Times New Roman" w:cs="Times New Roman"/>
-                <w:b w:val="0"/>
-                <w:bCs w:val="0"/>
-                <w:color w:val="auto"/>
-                <w:sz w:val="20"/>
-                <w:szCs w:val="20"/>
-              </w:rPr>
-            </w:pPr>
-            <w:r>
-              <w:rPr>
-                <w:rFonts w:ascii="Times New Roman" w:hAnsi="Times New Roman" w:cs="Times New Roman"/>
-                <w:b w:val="0"/>
-                <w:bCs w:val="0"/>
-                <w:color w:val="auto"/>
-                <w:sz w:val="20"/>
-                <w:szCs w:val="20"/>
-              </w:rPr>
-              <w:t xml:space="preserve">  </w:t>
-            </w:r>
-            <w:r>
-              <w:rPr>
-                <w:rFonts w:ascii="Times New Roman" w:hAnsi="Times New Roman" w:cs="Times New Roman"/>
-                <w:b w:val="0"/>
-                <w:bCs w:val="0"/>
-                <w:color w:val="auto"/>
-                <w:sz w:val="20"/>
-                <w:szCs w:val="20"/>
-              </w:rPr>
-              <w:t>Technology, Jain University,</w:t>
-            </w:r>
-          </w:p>
-          <w:p>
-            <w:pPr>
-              <w:pStyle w:val="Heading1"/>
-              <w:spacing w:before="0" w:after="0"/>
-              <w:jc w:val="both"/>
-              <w:rPr>
-                <w:rFonts w:ascii="Times New Roman" w:hAnsi="Times New Roman" w:cs="Times New Roman"/>
-                <w:color w:val="auto"/>
-              </w:rPr>
-            </w:pPr>
-            <w:r>
-              <w:rPr>
-                <w:rFonts w:ascii="Times New Roman" w:hAnsi="Times New Roman" w:cs="Times New Roman"/>
-                <w:b w:val="0"/>
-                <w:bCs w:val="0"/>
-                <w:color w:val="auto"/>
-                <w:sz w:val="20"/>
-                <w:szCs w:val="20"/>
-              </w:rPr>
-              <w:t xml:space="preserve">  </w:t>
-            </w:r>
-            <w:r>
-              <w:rPr>
-                <w:rFonts w:ascii="Times New Roman" w:hAnsi="Times New Roman" w:cs="Times New Roman"/>
-                <w:b w:val="0"/>
-                <w:bCs w:val="0"/>
-                <w:color w:val="auto"/>
-                <w:sz w:val="20"/>
-                <w:szCs w:val="20"/>
-              </w:rPr>
-              <w:t>Bengaluru, Karnataka, India</w:t>
-            </w:r>
-          </w:p>
-        </w:tc>
-      </w:tr>
-      <w:tr>
-        <w:trPr>
-          <w:jc w:val="right"/>
-        </w:trPr>
-        <w:tc>
-          <w:tcPr>
-            <w:tcW w:w="3236" w:type="dxa"/>
-          </w:tcPr>
-          <w:p>
-            <w:pPr>
-              <w:pStyle w:val="Heading1"/>
-              <w:spacing w:before="0" w:after="0"/>
-              <w:jc w:val="both"/>
-              <w:rPr>
-                <w:rFonts w:ascii="Times New Roman" w:hAnsi="Times New Roman" w:cs="Times New Roman"/>
-                <w:b w:val="0"/>
-                <w:bCs w:val="0"/>
-                <w:color w:val="auto"/>
-                <w:sz w:val="28"/>
-                <w:szCs w:val="28"/>
-              </w:rPr>
-            </w:pPr>
-            <w:r>
-              <w:rPr>
-                <w:rFonts w:ascii="Times New Roman" w:hAnsi="Times New Roman" w:cs="Times New Roman"/>
-                <w:b w:val="0"/>
-                <w:bCs w:val="0"/>
-                <w:color w:val="auto"/>
-                <w:sz w:val="28"/>
-                <w:szCs w:val="28"/>
-              </w:rPr>
-              <w:t xml:space="preserve">    </w:t>
-            </w:r>
-            <w:r>
-              <w:rPr>
-                <w:rFonts w:ascii="Times New Roman" w:hAnsi="Times New Roman" w:cs="Times New Roman"/>
-                <w:b w:val="0"/>
-                <w:bCs w:val="0"/>
-                <w:color w:val="auto"/>
-                <w:sz w:val="28"/>
-                <w:szCs w:val="28"/>
-              </w:rPr>
-              <w:t>Aryan Agrawal</w:t>
-            </w:r>
-          </w:p>
-          <w:p>
-            <w:pPr>
-              <w:pStyle w:val="Heading1"/>
-              <w:spacing w:before="0" w:after="0"/>
-              <w:jc w:val="both"/>
-              <w:rPr>
-                <w:rFonts w:ascii="Times New Roman" w:hAnsi="Times New Roman" w:cs="Times New Roman"/>
-                <w:b w:val="0"/>
-                <w:bCs w:val="0"/>
-                <w:color w:val="auto"/>
-                <w:sz w:val="20"/>
-                <w:szCs w:val="20"/>
-              </w:rPr>
-            </w:pPr>
-            <w:r>
-              <w:rPr>
-                <w:rFonts w:ascii="Times New Roman" w:hAnsi="Times New Roman" w:cs="Times New Roman"/>
-                <w:b w:val="0"/>
-                <w:bCs w:val="0"/>
-                <w:color w:val="auto"/>
-                <w:sz w:val="20"/>
-                <w:szCs w:val="20"/>
-              </w:rPr>
-              <w:t>Department of Computer Science</w:t>
-            </w:r>
-          </w:p>
-          <w:p>
-            <w:pPr>
-              <w:pStyle w:val="Heading1"/>
-              <w:spacing w:before="0" w:after="0"/>
-              <w:jc w:val="both"/>
-              <w:rPr>
-                <w:rFonts w:ascii="Times New Roman" w:hAnsi="Times New Roman" w:cs="Times New Roman"/>
-                <w:b w:val="0"/>
-                <w:bCs w:val="0"/>
-                <w:color w:val="auto"/>
-                <w:sz w:val="20"/>
-                <w:szCs w:val="20"/>
-              </w:rPr>
-            </w:pPr>
-            <w:r>
-              <w:rPr>
-                <w:rFonts w:ascii="Times New Roman" w:hAnsi="Times New Roman" w:cs="Times New Roman"/>
-                <w:b w:val="0"/>
-                <w:bCs w:val="0"/>
-                <w:color w:val="auto"/>
-                <w:sz w:val="20"/>
-                <w:szCs w:val="20"/>
-              </w:rPr>
-              <w:t xml:space="preserve">       </w:t>
-            </w:r>
-            <w:r>
-              <w:rPr>
-                <w:rFonts w:ascii="Times New Roman" w:hAnsi="Times New Roman" w:cs="Times New Roman"/>
-                <w:b w:val="0"/>
-                <w:bCs w:val="0"/>
-                <w:color w:val="auto"/>
-                <w:sz w:val="20"/>
-                <w:szCs w:val="20"/>
-              </w:rPr>
-              <w:t xml:space="preserve">   </w:t>
-            </w:r>
-            <w:r>
-              <w:rPr>
-                <w:rFonts w:ascii="Times New Roman" w:hAnsi="Times New Roman" w:cs="Times New Roman"/>
-                <w:b w:val="0"/>
-                <w:bCs w:val="0"/>
-                <w:color w:val="auto"/>
-                <w:sz w:val="20"/>
-                <w:szCs w:val="20"/>
-              </w:rPr>
-              <w:t>and Engineering,</w:t>
-            </w:r>
-          </w:p>
-          <w:p>
-            <w:pPr>
-              <w:pStyle w:val="Heading1"/>
-              <w:spacing w:before="0" w:after="0"/>
-              <w:jc w:val="both"/>
-              <w:rPr>
-                <w:rFonts w:ascii="Times New Roman" w:hAnsi="Times New Roman" w:cs="Times New Roman"/>
-                <w:b w:val="0"/>
-                <w:bCs w:val="0"/>
-                <w:color w:val="auto"/>
-                <w:sz w:val="20"/>
-                <w:szCs w:val="20"/>
-              </w:rPr>
-            </w:pPr>
-            <w:r>
-              <w:rPr>
-                <w:rFonts w:ascii="Times New Roman" w:hAnsi="Times New Roman" w:cs="Times New Roman"/>
-                <w:b w:val="0"/>
-                <w:bCs w:val="0"/>
-                <w:color w:val="auto"/>
-                <w:sz w:val="20"/>
-                <w:szCs w:val="20"/>
-              </w:rPr>
-              <w:t xml:space="preserve">  </w:t>
-            </w:r>
-            <w:r>
-              <w:rPr>
-                <w:rFonts w:ascii="Times New Roman" w:hAnsi="Times New Roman" w:cs="Times New Roman"/>
-                <w:b w:val="0"/>
-                <w:bCs w:val="0"/>
-                <w:color w:val="auto"/>
-                <w:sz w:val="20"/>
-                <w:szCs w:val="20"/>
-              </w:rPr>
-              <w:t>Faculty of Engineering and</w:t>
-            </w:r>
-          </w:p>
-          <w:p>
-            <w:pPr>
-              <w:pStyle w:val="Heading1"/>
-              <w:spacing w:before="0" w:after="0"/>
-              <w:jc w:val="both"/>
-              <w:rPr>
-                <w:rFonts w:ascii="Times New Roman" w:hAnsi="Times New Roman" w:cs="Times New Roman"/>
-                <w:b w:val="0"/>
-                <w:bCs w:val="0"/>
-                <w:color w:val="auto"/>
-                <w:sz w:val="20"/>
-                <w:szCs w:val="20"/>
-              </w:rPr>
-            </w:pPr>
-            <w:r>
-              <w:rPr>
-                <w:rFonts w:ascii="Times New Roman" w:hAnsi="Times New Roman" w:cs="Times New Roman"/>
-                <w:b w:val="0"/>
-                <w:bCs w:val="0"/>
-                <w:color w:val="auto"/>
-                <w:sz w:val="20"/>
-                <w:szCs w:val="20"/>
-              </w:rPr>
-              <w:t xml:space="preserve"> </w:t>
-            </w:r>
-            <w:r>
-              <w:rPr>
-                <w:rFonts w:ascii="Times New Roman" w:hAnsi="Times New Roman" w:cs="Times New Roman"/>
-                <w:b w:val="0"/>
-                <w:bCs w:val="0"/>
-                <w:color w:val="auto"/>
-                <w:sz w:val="20"/>
-                <w:szCs w:val="20"/>
-              </w:rPr>
-              <w:t>Technology, Jain University,</w:t>
-            </w:r>
-          </w:p>
-          <w:p>
-            <w:pPr>
-              <w:pStyle w:val="Heading1"/>
-              <w:spacing w:before="0" w:after="0"/>
-              <w:jc w:val="both"/>
-              <w:rPr>
-                <w:rFonts w:ascii="Times New Roman" w:hAnsi="Times New Roman" w:cs="Times New Roman"/>
-                <w:color w:val="auto"/>
-              </w:rPr>
-            </w:pPr>
-            <w:r>
-              <w:rPr>
-                <w:rFonts w:ascii="Times New Roman" w:hAnsi="Times New Roman" w:cs="Times New Roman"/>
-                <w:b w:val="0"/>
-                <w:bCs w:val="0"/>
-                <w:color w:val="auto"/>
-                <w:sz w:val="20"/>
-                <w:szCs w:val="20"/>
-              </w:rPr>
-              <w:t xml:space="preserve"> </w:t>
-            </w:r>
-            <w:r>
-              <w:rPr>
-                <w:rFonts w:ascii="Times New Roman" w:hAnsi="Times New Roman" w:cs="Times New Roman"/>
-                <w:b w:val="0"/>
-                <w:bCs w:val="0"/>
-                <w:color w:val="auto"/>
-                <w:sz w:val="20"/>
-                <w:szCs w:val="20"/>
-              </w:rPr>
-              <w:t>Bengaluru, Karnataka, India</w:t>
-            </w:r>
-          </w:p>
-        </w:tc>
-        <w:tc>
-          <w:tcPr>
-            <w:tcW w:w="3237" w:type="dxa"/>
-          </w:tcPr>
-          <w:p>
-            <w:pPr>
-              <w:pStyle w:val="Heading1"/>
-              <w:spacing w:before="0" w:after="0"/>
-              <w:jc w:val="both"/>
-              <w:rPr>
-                <w:rFonts w:ascii="Times New Roman" w:hAnsi="Times New Roman" w:cs="Times New Roman"/>
-                <w:b w:val="0"/>
-                <w:bCs w:val="0"/>
-                <w:color w:val="auto"/>
-                <w:sz w:val="28"/>
-                <w:szCs w:val="28"/>
-              </w:rPr>
-            </w:pPr>
-            <w:r>
+              <w:jc w:val="center"/>
               <w:rPr>
                 <w:rFonts w:ascii="Times New Roman" w:hAnsi="Times New Roman" w:cs="Times New Roman"/>
                 <w:color w:val="auto"/>
                 <w:sz w:val="24"/>
                 <w:szCs w:val="24"/>
               </w:rPr>
-              <w:t xml:space="preserve">    </w:t>
-            </w:r>
-            <w:proofErr w:type="spellStart"/>
-            <w:r>
-              <w:rPr>
-                <w:rFonts w:ascii="Times New Roman" w:hAnsi="Times New Roman" w:cs="Times New Roman"/>
-                <w:b w:val="0"/>
-                <w:bCs w:val="0"/>
-                <w:color w:val="auto"/>
-                <w:sz w:val="28"/>
-                <w:szCs w:val="28"/>
-              </w:rPr>
-              <w:t>Devansh</w:t>
-            </w:r>
-            <w:proofErr w:type="spellEnd"/>
-            <w:r>
-              <w:rPr>
-                <w:rFonts w:ascii="Times New Roman" w:hAnsi="Times New Roman" w:cs="Times New Roman"/>
-                <w:b w:val="0"/>
-                <w:bCs w:val="0"/>
-                <w:color w:val="auto"/>
-                <w:sz w:val="28"/>
-                <w:szCs w:val="28"/>
-              </w:rPr>
-              <w:t xml:space="preserve"> </w:t>
-            </w:r>
-            <w:r>
-              <w:rPr>
-                <w:rFonts w:ascii="Times New Roman" w:hAnsi="Times New Roman" w:cs="Times New Roman"/>
-                <w:b w:val="0"/>
-                <w:bCs w:val="0"/>
-                <w:color w:val="auto"/>
-                <w:sz w:val="28"/>
-                <w:szCs w:val="28"/>
-              </w:rPr>
-              <w:t>G</w:t>
-            </w:r>
-            <w:r>
-              <w:rPr>
-                <w:rFonts w:ascii="Times New Roman" w:hAnsi="Times New Roman" w:cs="Times New Roman"/>
-                <w:b w:val="0"/>
-                <w:bCs w:val="0"/>
-                <w:color w:val="auto"/>
-                <w:sz w:val="28"/>
-                <w:szCs w:val="28"/>
-              </w:rPr>
-              <w:t>upta M</w:t>
-            </w:r>
-          </w:p>
+            </w:pPr>
+          </w:p>
+        </w:tc>
+        <w:tc>
+          <w:tcPr>
+            <w:tcW w:w="3237" w:type="dxa"/>
+          </w:tcPr>
           <w:p>
             <w:pPr>
               <w:pStyle w:val="Heading1"/>
               <w:spacing w:before="0" w:after="0"/>
-              <w:jc w:val="both"/>
-              <w:rPr>
-                <w:rFonts w:ascii="Times New Roman" w:hAnsi="Times New Roman" w:cs="Times New Roman"/>
-                <w:b w:val="0"/>
-                <w:bCs w:val="0"/>
+              <w:jc w:val="center"/>
+              <w:rPr>
+                <w:rFonts w:ascii="Times New Roman" w:hAnsi="Times New Roman" w:cs="Times New Roman"/>
                 <w:color w:val="auto"/>
-                <w:sz w:val="20"/>
-                <w:szCs w:val="20"/>
-              </w:rPr>
-            </w:pPr>
-            <w:r>
-              <w:rPr>
-                <w:rFonts w:ascii="Times New Roman" w:hAnsi="Times New Roman" w:cs="Times New Roman"/>
-                <w:b w:val="0"/>
-                <w:bCs w:val="0"/>
-                <w:color w:val="auto"/>
-                <w:sz w:val="20"/>
-                <w:szCs w:val="20"/>
-              </w:rPr>
-              <w:t>Department of Computer Science</w:t>
-            </w:r>
-          </w:p>
-          <w:p>
-            <w:pPr>
-              <w:pStyle w:val="Heading1"/>
-              <w:spacing w:before="0" w:after="0"/>
-              <w:jc w:val="both"/>
-              <w:rPr>
-                <w:rFonts w:ascii="Times New Roman" w:hAnsi="Times New Roman" w:cs="Times New Roman"/>
-                <w:b w:val="0"/>
-                <w:bCs w:val="0"/>
-                <w:color w:val="auto"/>
-                <w:sz w:val="20"/>
-                <w:szCs w:val="20"/>
-              </w:rPr>
-            </w:pPr>
-            <w:r>
-              <w:rPr>
-                <w:rFonts w:ascii="Times New Roman" w:hAnsi="Times New Roman" w:cs="Times New Roman"/>
-                <w:b w:val="0"/>
-                <w:bCs w:val="0"/>
-                <w:color w:val="auto"/>
-                <w:sz w:val="20"/>
-                <w:szCs w:val="20"/>
-              </w:rPr>
-              <w:t xml:space="preserve">    </w:t>
-            </w:r>
-            <w:r>
-              <w:rPr>
-                <w:rFonts w:ascii="Times New Roman" w:hAnsi="Times New Roman" w:cs="Times New Roman"/>
-                <w:b w:val="0"/>
-                <w:bCs w:val="0"/>
-                <w:color w:val="auto"/>
-                <w:sz w:val="20"/>
-                <w:szCs w:val="20"/>
-              </w:rPr>
-              <w:t xml:space="preserve"> </w:t>
-            </w:r>
-            <w:r>
-              <w:rPr>
-                <w:rFonts w:ascii="Times New Roman" w:hAnsi="Times New Roman" w:cs="Times New Roman"/>
-                <w:b w:val="0"/>
-                <w:bCs w:val="0"/>
-                <w:color w:val="auto"/>
-                <w:sz w:val="20"/>
-                <w:szCs w:val="20"/>
-              </w:rPr>
-              <w:t xml:space="preserve"> </w:t>
-            </w:r>
-            <w:r>
-              <w:rPr>
-                <w:rFonts w:ascii="Times New Roman" w:hAnsi="Times New Roman" w:cs="Times New Roman"/>
-                <w:b w:val="0"/>
-                <w:bCs w:val="0"/>
-                <w:color w:val="auto"/>
-                <w:sz w:val="20"/>
-                <w:szCs w:val="20"/>
-              </w:rPr>
-              <w:t xml:space="preserve">   </w:t>
-            </w:r>
-            <w:r>
-              <w:rPr>
-                <w:rFonts w:ascii="Times New Roman" w:hAnsi="Times New Roman" w:cs="Times New Roman"/>
-                <w:b w:val="0"/>
-                <w:bCs w:val="0"/>
-                <w:color w:val="auto"/>
-                <w:sz w:val="20"/>
-                <w:szCs w:val="20"/>
-              </w:rPr>
-              <w:t xml:space="preserve"> </w:t>
-            </w:r>
-            <w:r>
-              <w:rPr>
-                <w:rFonts w:ascii="Times New Roman" w:hAnsi="Times New Roman" w:cs="Times New Roman"/>
-                <w:b w:val="0"/>
-                <w:bCs w:val="0"/>
-                <w:color w:val="auto"/>
-                <w:sz w:val="20"/>
-                <w:szCs w:val="20"/>
-              </w:rPr>
-              <w:t>and Engineering,</w:t>
-            </w:r>
-          </w:p>
-          <w:p>
-            <w:pPr>
-              <w:pStyle w:val="Heading1"/>
-              <w:spacing w:before="0" w:after="0"/>
-              <w:jc w:val="both"/>
-              <w:rPr>
-                <w:rFonts w:ascii="Times New Roman" w:hAnsi="Times New Roman" w:cs="Times New Roman"/>
-                <w:b w:val="0"/>
-                <w:bCs w:val="0"/>
-                <w:color w:val="auto"/>
-                <w:sz w:val="20"/>
-                <w:szCs w:val="20"/>
-              </w:rPr>
-            </w:pPr>
-            <w:r>
-              <w:rPr>
-                <w:rFonts w:ascii="Times New Roman" w:hAnsi="Times New Roman" w:cs="Times New Roman"/>
-                <w:b w:val="0"/>
-                <w:bCs w:val="0"/>
-                <w:color w:val="auto"/>
-                <w:sz w:val="20"/>
-                <w:szCs w:val="20"/>
-              </w:rPr>
-              <w:t xml:space="preserve">   </w:t>
-            </w:r>
-            <w:r>
-              <w:rPr>
-                <w:rFonts w:ascii="Times New Roman" w:hAnsi="Times New Roman" w:cs="Times New Roman"/>
-                <w:b w:val="0"/>
-                <w:bCs w:val="0"/>
-                <w:color w:val="auto"/>
-                <w:sz w:val="20"/>
-                <w:szCs w:val="20"/>
-              </w:rPr>
-              <w:t>Faculty of Engineering and</w:t>
-            </w:r>
-          </w:p>
-          <w:p>
-            <w:pPr>
-              <w:pStyle w:val="Heading1"/>
-              <w:spacing w:before="0" w:after="0"/>
-              <w:jc w:val="both"/>
-              <w:rPr>
-                <w:rFonts w:ascii="Times New Roman" w:hAnsi="Times New Roman" w:cs="Times New Roman"/>
-                <w:b w:val="0"/>
-                <w:bCs w:val="0"/>
-                <w:color w:val="auto"/>
-                <w:sz w:val="20"/>
-                <w:szCs w:val="20"/>
-              </w:rPr>
-            </w:pPr>
-            <w:r>
-              <w:rPr>
-                <w:rFonts w:ascii="Times New Roman" w:hAnsi="Times New Roman" w:cs="Times New Roman"/>
-                <w:b w:val="0"/>
-                <w:bCs w:val="0"/>
-                <w:color w:val="auto"/>
-                <w:sz w:val="20"/>
-                <w:szCs w:val="20"/>
-              </w:rPr>
-              <w:t xml:space="preserve">  </w:t>
-            </w:r>
-            <w:r>
-              <w:rPr>
-                <w:rFonts w:ascii="Times New Roman" w:hAnsi="Times New Roman" w:cs="Times New Roman"/>
-                <w:b w:val="0"/>
-                <w:bCs w:val="0"/>
-                <w:color w:val="auto"/>
-                <w:sz w:val="20"/>
-                <w:szCs w:val="20"/>
-              </w:rPr>
-              <w:t>Technology, Jain University,</w:t>
-            </w:r>
-          </w:p>
-          <w:p>
-            <w:pPr>
-              <w:pStyle w:val="Heading1"/>
-              <w:spacing w:before="0" w:after="0"/>
-              <w:jc w:val="both"/>
-              <w:rPr>
-                <w:rFonts w:ascii="Times New Roman" w:hAnsi="Times New Roman" w:cs="Times New Roman"/>
-                <w:color w:val="auto"/>
-              </w:rPr>
-            </w:pPr>
-            <w:r>
-              <w:rPr>
-                <w:rFonts w:ascii="Times New Roman" w:hAnsi="Times New Roman" w:cs="Times New Roman"/>
-                <w:b w:val="0"/>
-                <w:bCs w:val="0"/>
-                <w:color w:val="auto"/>
-                <w:sz w:val="20"/>
-                <w:szCs w:val="20"/>
-              </w:rPr>
-              <w:t xml:space="preserve">  </w:t>
-            </w:r>
-            <w:r>
-              <w:rPr>
-                <w:rFonts w:ascii="Times New Roman" w:hAnsi="Times New Roman" w:cs="Times New Roman"/>
-                <w:b w:val="0"/>
-                <w:bCs w:val="0"/>
-                <w:color w:val="auto"/>
-                <w:sz w:val="20"/>
-                <w:szCs w:val="20"/>
-              </w:rPr>
-              <w:t>Bengaluru, Karnataka, India</w:t>
-            </w:r>
-          </w:p>
-        </w:tc>
-        <w:tc>
-          <w:tcPr>
-            <w:tcW w:w="3237" w:type="dxa"/>
-          </w:tcPr>
-          <w:p>
-            <w:pPr>
-              <w:pStyle w:val="Heading1"/>
-              <w:spacing w:before="0" w:after="0"/>
-              <w:jc w:val="both"/>
-              <w:rPr>
-                <w:rFonts w:ascii="Times New Roman" w:hAnsi="Times New Roman" w:cs="Times New Roman"/>
-                <w:b w:val="0"/>
-                <w:bCs w:val="0"/>
-                <w:color w:val="auto"/>
-                <w:sz w:val="28"/>
-                <w:szCs w:val="28"/>
-              </w:rPr>
-            </w:pPr>
-            <w:r>
-              <w:rPr>
-                <w:rFonts w:ascii="Times New Roman" w:hAnsi="Times New Roman" w:cs="Times New Roman"/>
-                <w:color w:val="auto"/>
-              </w:rPr>
-              <w:t xml:space="preserve">    </w:t>
-            </w:r>
-            <w:r>
-              <w:rPr>
-                <w:rFonts w:ascii="Times New Roman" w:hAnsi="Times New Roman" w:cs="Times New Roman"/>
-                <w:color w:val="auto"/>
-                <w:sz w:val="24"/>
-                <w:szCs w:val="24"/>
-              </w:rPr>
-              <w:t xml:space="preserve"> </w:t>
-            </w:r>
-            <w:r>
-              <w:rPr>
-                <w:rFonts w:ascii="Times New Roman" w:hAnsi="Times New Roman" w:cs="Times New Roman"/>
-                <w:color w:val="auto"/>
-                <w:sz w:val="24"/>
-                <w:szCs w:val="24"/>
-              </w:rPr>
-              <w:t xml:space="preserve">  </w:t>
-            </w:r>
-            <w:proofErr w:type="spellStart"/>
-            <w:r>
-              <w:rPr>
-                <w:rFonts w:ascii="Times New Roman" w:hAnsi="Times New Roman" w:cs="Times New Roman"/>
-                <w:b w:val="0"/>
-                <w:bCs w:val="0"/>
-                <w:color w:val="auto"/>
-                <w:sz w:val="28"/>
-                <w:szCs w:val="28"/>
-              </w:rPr>
-              <w:t>Druvraaj</w:t>
-            </w:r>
-            <w:proofErr w:type="spellEnd"/>
-          </w:p>
-          <w:p>
-            <w:pPr>
-              <w:pStyle w:val="Heading1"/>
-              <w:spacing w:before="0" w:after="0"/>
-              <w:jc w:val="both"/>
-              <w:rPr>
-                <w:rFonts w:ascii="Times New Roman" w:hAnsi="Times New Roman" w:cs="Times New Roman"/>
-                <w:b w:val="0"/>
-                <w:bCs w:val="0"/>
-                <w:color w:val="auto"/>
-                <w:sz w:val="20"/>
-                <w:szCs w:val="20"/>
-              </w:rPr>
-            </w:pPr>
-            <w:r>
-              <w:rPr>
-                <w:rFonts w:ascii="Times New Roman" w:hAnsi="Times New Roman" w:cs="Times New Roman"/>
-                <w:b w:val="0"/>
-                <w:bCs w:val="0"/>
-                <w:color w:val="auto"/>
-                <w:sz w:val="20"/>
-                <w:szCs w:val="20"/>
-              </w:rPr>
-              <w:t>Department of Computer Science</w:t>
-            </w:r>
-          </w:p>
-          <w:p>
-            <w:pPr>
-              <w:pStyle w:val="Heading1"/>
-              <w:spacing w:before="0" w:after="0"/>
-              <w:jc w:val="both"/>
-              <w:rPr>
-                <w:rFonts w:ascii="Times New Roman" w:hAnsi="Times New Roman" w:cs="Times New Roman"/>
-                <w:b w:val="0"/>
-                <w:bCs w:val="0"/>
-                <w:color w:val="auto"/>
-                <w:sz w:val="20"/>
-                <w:szCs w:val="20"/>
-              </w:rPr>
-            </w:pPr>
-            <w:r>
-              <w:rPr>
-                <w:rFonts w:ascii="Times New Roman" w:hAnsi="Times New Roman" w:cs="Times New Roman"/>
-                <w:b w:val="0"/>
-                <w:bCs w:val="0"/>
-                <w:color w:val="auto"/>
-                <w:sz w:val="20"/>
-                <w:szCs w:val="20"/>
-              </w:rPr>
-              <w:t xml:space="preserve">      </w:t>
-            </w:r>
-            <w:r>
-              <w:rPr>
-                <w:rFonts w:ascii="Times New Roman" w:hAnsi="Times New Roman" w:cs="Times New Roman"/>
-                <w:b w:val="0"/>
-                <w:bCs w:val="0"/>
-                <w:color w:val="auto"/>
-                <w:sz w:val="20"/>
-                <w:szCs w:val="20"/>
-              </w:rPr>
-              <w:t xml:space="preserve"> </w:t>
-            </w:r>
-            <w:r>
-              <w:rPr>
-                <w:rFonts w:ascii="Times New Roman" w:hAnsi="Times New Roman" w:cs="Times New Roman"/>
-                <w:b w:val="0"/>
-                <w:bCs w:val="0"/>
-                <w:color w:val="auto"/>
-                <w:sz w:val="20"/>
-                <w:szCs w:val="20"/>
-              </w:rPr>
-              <w:t xml:space="preserve">  </w:t>
-            </w:r>
-            <w:r>
-              <w:rPr>
-                <w:rFonts w:ascii="Times New Roman" w:hAnsi="Times New Roman" w:cs="Times New Roman"/>
-                <w:b w:val="0"/>
-                <w:bCs w:val="0"/>
-                <w:color w:val="auto"/>
-                <w:sz w:val="20"/>
-                <w:szCs w:val="20"/>
-              </w:rPr>
-              <w:t>and Engineering,</w:t>
-            </w:r>
-          </w:p>
-          <w:p>
-            <w:pPr>
-              <w:pStyle w:val="Heading1"/>
-              <w:spacing w:before="0" w:after="0"/>
-              <w:jc w:val="both"/>
-              <w:rPr>
-                <w:rFonts w:ascii="Times New Roman" w:hAnsi="Times New Roman" w:cs="Times New Roman"/>
-                <w:b w:val="0"/>
-                <w:bCs w:val="0"/>
-                <w:color w:val="auto"/>
-                <w:sz w:val="20"/>
-                <w:szCs w:val="20"/>
-              </w:rPr>
-            </w:pPr>
-            <w:r>
-              <w:rPr>
-                <w:rFonts w:ascii="Times New Roman" w:hAnsi="Times New Roman" w:cs="Times New Roman"/>
-                <w:b w:val="0"/>
-                <w:bCs w:val="0"/>
-                <w:color w:val="auto"/>
-                <w:sz w:val="20"/>
-                <w:szCs w:val="20"/>
-              </w:rPr>
-              <w:t xml:space="preserve">   </w:t>
-            </w:r>
-            <w:r>
-              <w:rPr>
-                <w:rFonts w:ascii="Times New Roman" w:hAnsi="Times New Roman" w:cs="Times New Roman"/>
-                <w:b w:val="0"/>
-                <w:bCs w:val="0"/>
-                <w:color w:val="auto"/>
-                <w:sz w:val="20"/>
-                <w:szCs w:val="20"/>
-              </w:rPr>
-              <w:t>Faculty of Engineering and</w:t>
-            </w:r>
-          </w:p>
-          <w:p>
-            <w:pPr>
-              <w:pStyle w:val="Heading1"/>
-              <w:spacing w:before="0" w:after="0"/>
-              <w:jc w:val="both"/>
-              <w:rPr>
-                <w:rFonts w:ascii="Times New Roman" w:hAnsi="Times New Roman" w:cs="Times New Roman"/>
-                <w:b w:val="0"/>
-                <w:bCs w:val="0"/>
-                <w:color w:val="auto"/>
-                <w:sz w:val="20"/>
-                <w:szCs w:val="20"/>
-              </w:rPr>
-            </w:pPr>
-            <w:r>
-              <w:rPr>
-                <w:rFonts w:ascii="Times New Roman" w:hAnsi="Times New Roman" w:cs="Times New Roman"/>
-                <w:b w:val="0"/>
-                <w:bCs w:val="0"/>
-                <w:color w:val="auto"/>
-                <w:sz w:val="20"/>
-                <w:szCs w:val="20"/>
-              </w:rPr>
-              <w:t xml:space="preserve">  </w:t>
-            </w:r>
-            <w:r>
-              <w:rPr>
-                <w:rFonts w:ascii="Times New Roman" w:hAnsi="Times New Roman" w:cs="Times New Roman"/>
-                <w:b w:val="0"/>
-                <w:bCs w:val="0"/>
-                <w:color w:val="auto"/>
-                <w:sz w:val="20"/>
-                <w:szCs w:val="20"/>
-              </w:rPr>
-              <w:t>Technology, Jain University,</w:t>
-            </w:r>
-          </w:p>
-          <w:p>
-            <w:pPr>
-              <w:pStyle w:val="Heading1"/>
-              <w:spacing w:before="0" w:after="0"/>
-              <w:jc w:val="both"/>
-              <w:rPr>
-                <w:rFonts w:ascii="Times New Roman" w:hAnsi="Times New Roman" w:cs="Times New Roman"/>
-                <w:color w:val="auto"/>
-              </w:rPr>
-            </w:pPr>
-            <w:r>
-              <w:rPr>
-                <w:rFonts w:ascii="Times New Roman" w:hAnsi="Times New Roman" w:cs="Times New Roman"/>
-                <w:b w:val="0"/>
-                <w:bCs w:val="0"/>
-                <w:color w:val="auto"/>
-                <w:sz w:val="20"/>
-                <w:szCs w:val="20"/>
-              </w:rPr>
-              <w:t xml:space="preserve">  </w:t>
-            </w:r>
-            <w:r>
-              <w:rPr>
-                <w:rFonts w:ascii="Times New Roman" w:hAnsi="Times New Roman" w:cs="Times New Roman"/>
-                <w:b w:val="0"/>
-                <w:bCs w:val="0"/>
-                <w:color w:val="auto"/>
-                <w:sz w:val="20"/>
-                <w:szCs w:val="20"/>
-              </w:rPr>
-              <w:t>Bengaluru, Karnataka, India</w:t>
-            </w:r>
+              </w:rPr>
+            </w:pPr>
           </w:p>
         </w:tc>
       </w:tr>
@@ -1841,7 +1621,14 @@
         <w:rPr>
           <w:rFonts w:ascii="Times New Roman" w:hAnsi="Times New Roman" w:cs="Times New Roman"/>
         </w:rPr>
-        <w:t>branch based on a convolutional neural network processing Mel-spectrogram and</w:t>
+        <w:t>branch based on a convolutional neural network processing Mel-</w:t>
+      </w:r>
+      <w:r>
+        <w:rPr>
+          <w:rFonts w:ascii="Times New Roman" w:hAnsi="Times New Roman" w:cs="Times New Roman"/>
+        </w:rPr>
+        <w:lastRenderedPageBreak/>
+        <w:t>spectrogram and</w:t>
       </w:r>
       <w:r>
         <w:rPr>
@@ -2015,7 +1802,6 @@
         <w:rPr>
           <w:rFonts w:ascii="Times New Roman" w:hAnsi="Times New Roman" w:cs="Times New Roman"/>
         </w:rPr>
-        <w:lastRenderedPageBreak/>
         <w:t>The results demonstrate that multimodal learning combined with attention-based fusion</w:t>
       </w:r>
       <w:r>
@@ -2209,7 +1995,13 @@
         <w:rPr>
           <w:rFonts w:ascii="Times New Roman" w:hAnsi="Times New Roman" w:cs="Times New Roman"/>
         </w:rPr>
-        <w:t xml:space="preserve">why researchers are pushing for better ways to automatically spot these fakes. In this paper, we walk through how we built a new deepfake detector—a system that checks both images and audio together instead of just focusing on one. We explain how we designed the network, how we trained it, and what we found in our experiments. This system stands out because, unlike most detectors that only look at pictures or sound by themselves, it uses both at once. We use a cross-modal attention-based fusion technique, which basically means the network decides how much weight to give to the image stream or the speech stream, based on which one seems more useful for each video. We trained and tested the detector using the </w:t>
+        <w:t xml:space="preserve">why researchers are pushing for better ways to automatically spot these fakes. In this paper, we walk through how we built a new deepfake detector—a system that checks both images and audio together instead of just focusing on one. We explain how we </w:t>
+      </w:r>
+      <w:r>
+        <w:rPr>
+          <w:rFonts w:ascii="Times New Roman" w:hAnsi="Times New Roman" w:cs="Times New Roman"/>
+        </w:rPr>
+        <w:t xml:space="preserve">designed the network, how we trained it, and what we found in our experiments. This system stands out because, unlike most detectors that only look at pictures or sound by themselves, it uses both at once. We use a cross-modal attention-based fusion technique, which basically means the network decides how much weight to give to the image stream or the speech stream, based on which one seems more useful for each video. We trained and tested the detector using the </w:t>
       </w:r>
       <w:proofErr w:type="spellStart"/>
       <w:r>
@@ -2346,7 +2138,14 @@
         <w:rPr>
           <w:rFonts w:ascii="Times New Roman" w:hAnsi="Times New Roman" w:cs="Times New Roman"/>
         </w:rPr>
-        <w:t>Audio Modality Weakness: The artifacts for the audio modality of deepfake are hard to detect, making learning difficult. The naïvely trained audio branch gives almost random results, which introduces noise in the fusion layer and negatively impacts overall performance.</w:t>
+        <w:t xml:space="preserve">Audio Modality Weakness: The artifacts for the audio modality of deepfake are hard to detect, making learning difficult. The naïvely trained audio branch gives almost random results, which introduces noise in </w:t>
+      </w:r>
+      <w:r>
+        <w:rPr>
+          <w:rFonts w:ascii="Times New Roman" w:hAnsi="Times New Roman" w:cs="Times New Roman"/>
+        </w:rPr>
+        <w:lastRenderedPageBreak/>
+        <w:t>the fusion layer and negatively impacts overall performance.</w:t>
       </w:r>
     </w:p>
     <w:p>
@@ -2400,14 +2199,7 @@
         <w:rPr>
           <w:rFonts w:ascii="Times New Roman" w:hAnsi="Times New Roman" w:cs="Times New Roman"/>
         </w:rPr>
-        <w:t xml:space="preserve"> network together with </w:t>
-      </w:r>
-      <w:r>
-        <w:rPr>
-          <w:rFonts w:ascii="Times New Roman" w:hAnsi="Times New Roman" w:cs="Times New Roman"/>
-        </w:rPr>
-        <w:lastRenderedPageBreak/>
-        <w:t xml:space="preserve">randomised fusion layers generates large gradient updates, overriding the pretrained </w:t>
+        <w:t xml:space="preserve"> network together with randomised fusion layers generates large gradient updates, overriding the pretrained </w:t>
       </w:r>
     </w:p>
     <w:p>
@@ -2522,7 +2314,13 @@
         <w:rPr>
           <w:rFonts w:ascii="Times New Roman" w:hAnsi="Times New Roman" w:cs="Times New Roman"/>
         </w:rPr>
-        <w:t xml:space="preserve"> separable convolutions, which decouple spatial and cross-channel feature extraction into two distinct operations. This design enables more efficient utilization of model parameters compared to traditional convolutional networks while maintaining high representational power. By replacing conventional Inception modules with </w:t>
+        <w:t xml:space="preserve"> separable convolutions, which decouple spatial and cross-channel feature extraction into two distinct operations. This design enables more efficient utilization of model parameters compared to traditional convolutional networks while maintaining high representational power. By </w:t>
+      </w:r>
+      <w:r>
+        <w:rPr>
+          <w:rFonts w:ascii="Times New Roman" w:hAnsi="Times New Roman" w:cs="Times New Roman"/>
+        </w:rPr>
+        <w:t xml:space="preserve">replacing conventional Inception modules with </w:t>
       </w:r>
       <w:proofErr w:type="spellStart"/>
       <w:r>
@@ -2606,13 +2404,7 @@
         <w:rPr>
           <w:rFonts w:ascii="Times New Roman" w:hAnsi="Times New Roman" w:cs="Times New Roman"/>
         </w:rPr>
-        <w:t xml:space="preserve">-based classification. Their approach employs Multi-task Cascaded Convolutional Networks </w:t>
-      </w:r>
-      <w:r>
-        <w:rPr>
-          <w:rFonts w:ascii="Times New Roman" w:hAnsi="Times New Roman" w:cs="Times New Roman"/>
-        </w:rPr>
-        <w:t xml:space="preserve">(MTCNN) to accurately detect and track facial regions within video frames, followed by classification using a fine-tuned </w:t>
+        <w:t xml:space="preserve">-based classification. Their approach employs Multi-task Cascaded Convolutional Networks (MTCNN) to accurately detect and track facial regions within video frames, followed by classification using a fine-tuned </w:t>
       </w:r>
       <w:proofErr w:type="spellStart"/>
       <w:r>
@@ -2806,7 +2598,14 @@
         <w:rPr>
           <w:rFonts w:ascii="Times New Roman" w:hAnsi="Times New Roman" w:cs="Times New Roman"/>
         </w:rPr>
-        <w:t xml:space="preserve"> achieves high detection accuracy on uncompressed and high-quality video data, while maintaining reasonable performance even under compression. This demonstrates the robustness of deep learning-based approaches in handling variations in data quality, which is a critical factor in real-world deployment scenarios. The study further reinforces the role of large-scale datasets and targeted preprocessing strategies in improving the generalization capability of deepfake detection systems.</w:t>
+        <w:t xml:space="preserve"> achieves high detection accuracy on uncompressed and high-quality video data, while maintaining reasonable performance even under compression. This demonstrates the robustness of </w:t>
+      </w:r>
+      <w:r>
+        <w:rPr>
+          <w:rFonts w:ascii="Times New Roman" w:hAnsi="Times New Roman" w:cs="Times New Roman"/>
+        </w:rPr>
+        <w:lastRenderedPageBreak/>
+        <w:t>deep learning-based approaches in handling variations in data quality, which is a critical factor in real-world deployment scenarios. The study further reinforces the role of large-scale datasets and targeted preprocessing strategies in improving the generalization capability of deepfake detection systems.</w:t>
       </w:r>
     </w:p>
     <w:p>
@@ -2856,7 +2655,6 @@
         <w:rPr>
           <w:rFonts w:ascii="Times New Roman" w:hAnsi="Times New Roman" w:cs="Times New Roman"/>
         </w:rPr>
-        <w:lastRenderedPageBreak/>
         <w:t xml:space="preserve">classification performance, demonstrating the effectiveness of </w:t>
       </w:r>
       <w:proofErr w:type="spellStart"/>
@@ -4105,6 +3903,7 @@
         <w:rPr>
           <w:rFonts w:ascii="Times New Roman" w:hAnsi="Times New Roman" w:cs="Times New Roman"/>
         </w:rPr>
+        <w:lastRenderedPageBreak/>
         <w:t xml:space="preserve">About 4,067 videos were downloaded in order to increase the total number of real videos to 4,567. As a consequence, at the 4:1 ratio, around 87% of all </w:t>
       </w:r>
       <w:proofErr w:type="spellStart"/>
@@ -4158,14 +3957,7 @@
         <w:rPr>
           <w:rFonts w:ascii="Times New Roman" w:hAnsi="Times New Roman" w:cs="Times New Roman"/>
         </w:rPr>
-        <w:t>A necessary condition of the methodology is the absence of overlap between identities in training and validation datasets. The individual video-based split ensures the model is exposed to the same iden</w:t>
-      </w:r>
-      <w:r>
-        <w:rPr>
-          <w:rFonts w:ascii="Times New Roman" w:hAnsi="Times New Roman" w:cs="Times New Roman"/>
-        </w:rPr>
-        <w:lastRenderedPageBreak/>
-        <w:t>tity within the training and testing processes; therefore, the model will learn based on the face identity rather than the deepfake artifacts. This results in exaggerated metrics – in the case of the naïve video-based split, 99% accuracy was achieved.</w:t>
+        <w:t>A necessary condition of the methodology is the absence of overlap between identities in training and validation datasets. The individual video-based split ensures the model is exposed to the same identity within the training and testing processes; therefore, the model will learn based on the face identity rather than the deepfake artifacts. This results in exaggerated metrics – in the case of the naïve video-based split, 99% accuracy was achieved.</w:t>
       </w:r>
     </w:p>
     <w:p>
@@ -4713,7 +4505,13 @@
         <w:rPr>
           <w:rFonts w:ascii="Times New Roman" w:hAnsi="Times New Roman" w:cs="Times New Roman"/>
         </w:rPr>
-        <w:t>The proposed framework adopts a multi-modal dual-branch framework where both the visual stream and the auditory stream are processed independently, then fused together via cross-modal attention. The framework includes three major modules: visual branch, audio branch, and fusion layer.</w:t>
+        <w:t xml:space="preserve">The proposed framework adopts a multi-modal dual-branch framework where both the visual </w:t>
+      </w:r>
+      <w:r>
+        <w:rPr>
+          <w:rFonts w:ascii="Times New Roman" w:hAnsi="Times New Roman" w:cs="Times New Roman"/>
+        </w:rPr>
+        <w:t>stream and the auditory stream are processed independently, then fused together via cross-modal attention. The framework includes three major modules: visual branch, audio branch, and fusion layer.</w:t>
       </w:r>
     </w:p>
     <w:p>
@@ -4949,6 +4747,7 @@
                 <w:b/>
                 <w:bCs/>
               </w:rPr>
+              <w:lastRenderedPageBreak/>
               <w:t>Component</w:t>
             </w:r>
           </w:p>
@@ -5166,7 +4965,6 @@
               <w:rPr>
                 <w:rFonts w:ascii="Times New Roman" w:hAnsi="Times New Roman" w:cs="Times New Roman"/>
               </w:rPr>
-              <w:lastRenderedPageBreak/>
               <w:t>Trainable Layers - Phase 1</w:t>
             </w:r>
           </w:p>
@@ -6216,14 +6014,14 @@
         <w:rPr>
           <w:rFonts w:ascii="Times New Roman" w:hAnsi="Times New Roman" w:cs="Times New Roman"/>
         </w:rPr>
-        <w:t>In this way, the model can actively suppress any contribution coming from an unreliable modality for each single sample. In case the audio branch is noisy or uninformative, the gate learns to make its coefficients tend to zero in order to avoid contaminating the fused predictions. In the evaluation stage, the gate was shown to be capable of extracting use</w:t>
+        <w:t xml:space="preserve">In this way, the model can actively suppress any contribution coming from an unreliable modality for each single sample. In case the audio branch is noisy or uninformative, the gate learns to make its coefficients tend to zero in order to avoid contaminating the fused predictions. In the evaluation stage, </w:t>
       </w:r>
       <w:r>
         <w:rPr>
           <w:rFonts w:ascii="Times New Roman" w:hAnsi="Times New Roman" w:cs="Times New Roman"/>
         </w:rPr>
         <w:lastRenderedPageBreak/>
-        <w:t>ful information from the audio modality as indicated by an audio AUC of 0.827 (significantly higher than random) compared to 0.959 (visual).</w:t>
+        <w:t>the gate was shown to be capable of extracting useful information from the audio modality as indicated by an audio AUC of 0.827 (significantly higher than random) compared to 0.959 (visual).</w:t>
       </w:r>
     </w:p>
     <w:p>
@@ -6687,13 +6485,13 @@
         <w:rPr>
           <w:rFonts w:ascii="Times New Roman" w:hAnsi="Times New Roman" w:cs="Times New Roman"/>
         </w:rPr>
-        <w:t xml:space="preserve"> parameters during the beginning of the training process. The absence of the staged training resulted in binary cross-entropy loss not falling below 4.0 due </w:t>
-      </w:r>
-      <w:r>
-        <w:rPr>
-          <w:rFonts w:ascii="Times New Roman" w:hAnsi="Times New Roman" w:cs="Times New Roman"/>
-        </w:rPr>
-        <w:t>to corruption of ImageNet representation during deepfakes processing.</w:t>
+        <w:t xml:space="preserve"> parameters during the beginning of the training process. The absence of the staged training resulted in </w:t>
+      </w:r>
+      <w:r>
+        <w:rPr>
+          <w:rFonts w:ascii="Times New Roman" w:hAnsi="Times New Roman" w:cs="Times New Roman"/>
+        </w:rPr>
+        <w:t>binary cross-entropy loss not falling below 4.0 due to corruption of ImageNet representation during deepfakes processing.</w:t>
       </w:r>
     </w:p>
     <w:p>
@@ -7345,7 +7143,14 @@
         <w:rPr>
           <w:rFonts w:ascii="Times New Roman" w:hAnsi="Times New Roman" w:cs="Times New Roman"/>
         </w:rPr>
-        <w:t>Each training batch contains exactly 50% real and 50% fake samples regardless of the dataset ratio. The Data</w:t>
+        <w:t xml:space="preserve">Each training batch contains exactly 50% real and 50% fake samples regardless of the dataset ratio. </w:t>
+      </w:r>
+      <w:r>
+        <w:rPr>
+          <w:rFonts w:ascii="Times New Roman" w:hAnsi="Times New Roman" w:cs="Times New Roman"/>
+        </w:rPr>
+        <w:lastRenderedPageBreak/>
+        <w:t>The Data</w:t>
       </w:r>
       <w:r>
         <w:rPr>
@@ -7374,7 +7179,6 @@
           <w:rFonts w:ascii="Times New Roman" w:hAnsi="Times New Roman" w:cs="Times New Roman"/>
           <w:color w:val="auto"/>
         </w:rPr>
-        <w:lastRenderedPageBreak/>
         <w:t>Sample Weights</w:t>
       </w:r>
     </w:p>
@@ -12327,7 +12131,7 @@
 </file>
 
 <file path=word/numbering.xml><?xml version="1.0" encoding="utf-8"?>
-<w:numbering xmlns:wpc="http://schemas.microsoft.com/office/word/2010/wordprocessingCanvas" xmlns:cx="http://schemas.microsoft.com/office/drawing/2014/chartex" xmlns:cx1="http://schemas.microsoft.com/office/drawing/2015/9/8/chartex" xmlns:cx2="http://schemas.microsoft.com/office/drawing/2015/10/21/chartex" xmlns:cx3="http://schemas.microsoft.com/office/drawing/2016/5/9/chartex" xmlns:cx4="http://schemas.microsoft.com/office/drawing/2016/5/10/chartex" xmlns:cx5="http://schemas.microsoft.com/office/drawing/2016/5/11/chartex" xmlns:cx6="http://schemas.microsoft.com/office/drawing/2016/5/12/chartex" xmlns:cx7="http://schemas.microsoft.com/office/drawing/2016/5/13/chartex" xmlns:cx8="http://schemas.microsoft.com/office/drawing/2016/5/14/chartex" xmlns:mc="http://schemas.openxmlformats.org/markup-compatibility/2006" xmlns:aink="http://schemas.microsoft.com/office/drawing/2016/ink" xmlns:am3d="http://schemas.microsoft.com/office/drawing/2017/model3d" xmlns:o="urn:schemas-microsoft-com:office:office" xmlns:r="http://schemas.openxmlformats.org/officeDocument/2006/relationships" xmlns:m="http://schemas.openxmlformats.org/officeDocument/2006/math" xmlns:v="urn:schemas-microsoft-com:vml" xmlns:wp14="http://schemas.microsoft.com/office/word/2010/wordprocessingDrawing" xmlns:wp="http://schemas.openxmlformats.org/drawingml/2006/wordprocessingDrawing" xmlns:w10="urn:schemas-microsoft-com:office:word" xmlns:w="http://schemas.openxmlformats.org/wordprocessingml/2006/main" xmlns:w14="http://schemas.microsoft.com/office/word/2010/wordml" xmlns:w15="http://schemas.microsoft.com/office/word/2012/wordml" xmlns:w16cex="http://schemas.microsoft.com/office/word/2018/wordml/cex" xmlns:w16cid="http://schemas.microsoft.com/office/word/2016/wordml/cid" xmlns:w16="http://schemas.microsoft.com/office/word/2018/wordml" xmlns:w16sdtdh="http://schemas.microsoft.com/office/word/2020/wordml/sdtdatahash" xmlns:w16se="http://schemas.microsoft.com/office/word/2015/wordml/symex" xmlns:wpg="http://schemas.microsoft.com/office/word/2010/wordprocessingGroup" xmlns:wpi="http://schemas.microsoft.com/office/word/2010/wordprocessingInk" xmlns:wne="http://schemas.microsoft.com/office/word/2006/wordml" xmlns:wps="http://schemas.microsoft.com/office/word/2010/wordprocessingShape" mc:Ignorable="w14 w15 w16se w16cid w16 w16cex w16sdtdh wp14">
+<w:numbering xmlns:wpc="http://schemas.microsoft.com/office/word/2010/wordprocessingCanvas" xmlns:cx="http://schemas.microsoft.com/office/drawing/2014/chartex" xmlns:cx1="http://schemas.microsoft.com/office/drawing/2015/9/8/chartex" xmlns:cx2="http://schemas.microsoft.com/office/drawing/2015/10/21/chartex" xmlns:cx3="http://schemas.microsoft.com/office/drawing/2016/5/9/chartex" xmlns:cx4="http://schemas.microsoft.com/office/drawing/2016/5/10/chartex" xmlns:cx5="http://schemas.microsoft.com/office/drawing/2016/5/11/chartex" xmlns:cx6="http://schemas.microsoft.com/office/drawing/2016/5/12/chartex" xmlns:cx7="http://schemas.microsoft.com/office/drawing/2016/5/13/chartex" xmlns:cx8="http://schemas.microsoft.com/office/drawing/2016/5/14/chartex" xmlns:mc="http://schemas.openxmlformats.org/markup-compatibility/2006" xmlns:aink="http://schemas.microsoft.com/office/drawing/2016/ink" xmlns:am3d="http://schemas.microsoft.com/office/drawing/2017/model3d" xmlns:o="urn:schemas-microsoft-com:office:office" xmlns:oel="http://schemas.microsoft.com/office/2019/extlst" xmlns:r="http://schemas.openxmlformats.org/officeDocument/2006/relationships" xmlns:m="http://schemas.openxmlformats.org/officeDocument/2006/math" xmlns:v="urn:schemas-microsoft-com:vml" xmlns:wp14="http://schemas.microsoft.com/office/word/2010/wordprocessingDrawing" xmlns:wp="http://schemas.openxmlformats.org/drawingml/2006/wordprocessingDrawing" xmlns:w10="urn:schemas-microsoft-com:office:word" xmlns:w="http://schemas.openxmlformats.org/wordprocessingml/2006/main" xmlns:w14="http://schemas.microsoft.com/office/word/2010/wordml" xmlns:w15="http://schemas.microsoft.com/office/word/2012/wordml" xmlns:w16cex="http://schemas.microsoft.com/office/word/2018/wordml/cex" xmlns:w16cid="http://schemas.microsoft.com/office/word/2016/wordml/cid" xmlns:w16="http://schemas.microsoft.com/office/word/2018/wordml" xmlns:w16sdtdh="http://schemas.microsoft.com/office/word/2020/wordml/sdtdatahash" xmlns:w16se="http://schemas.microsoft.com/office/word/2015/wordml/symex" xmlns:wpg="http://schemas.microsoft.com/office/word/2010/wordprocessingGroup" xmlns:wpi="http://schemas.microsoft.com/office/word/2010/wordprocessingInk" xmlns:wne="http://schemas.microsoft.com/office/word/2006/wordml" xmlns:wps="http://schemas.microsoft.com/office/word/2010/wordprocessingShape" mc:Ignorable="w14 w15 w16se w16cid w16 w16cex w16sdtdh wp14">
   <w:abstractNum w:abstractNumId="0" w15:restartNumberingAfterBreak="0">
     <w:nsid w:val="00C66067"/>
     <w:multiLevelType w:val="hybridMultilevel"/>
@@ -12745,25 +12549,25 @@
       <w:lvlJc w:val="left"/>
     </w:lvl>
   </w:abstractNum>
-  <w:num w:numId="1">
+  <w:num w:numId="1" w16cid:durableId="602684737">
     <w:abstractNumId w:val="0"/>
     <w:lvlOverride w:ilvl="0">
       <w:startOverride w:val="1"/>
     </w:lvlOverride>
   </w:num>
-  <w:num w:numId="2">
+  <w:num w:numId="2" w16cid:durableId="1520003861">
     <w:abstractNumId w:val="4"/>
     <w:lvlOverride w:ilvl="0">
       <w:startOverride w:val="1"/>
     </w:lvlOverride>
   </w:num>
-  <w:num w:numId="3">
+  <w:num w:numId="3" w16cid:durableId="242304854">
     <w:abstractNumId w:val="4"/>
   </w:num>
-  <w:num w:numId="4">
+  <w:num w:numId="4" w16cid:durableId="2045985451">
     <w:abstractNumId w:val="2"/>
   </w:num>
-  <w:num w:numId="5">
+  <w:num w:numId="5" w16cid:durableId="1452818219">
     <w:abstractNumId w:val="1"/>
   </w:num>
 </w:numbering>

</xml_diff>